<commit_message>
Refactor and clarify text in the Hidden Gems analysis section for improved readability and understanding
</commit_message>
<xml_diff>
--- a/docs/writeup_lastlyupdated08.08.docx
+++ b/docs/writeup_lastlyupdated08.08.docx
@@ -85,7 +85,21 @@
         <w:rPr>
           <w:rFonts w:hint="cs"/>
         </w:rPr>
-        <w:t xml:space="preserve"> | הילה צאיג | נעה גרוס</w:t>
+        <w:t xml:space="preserve"> | הילה </w:t>
+      </w:r>
+      <w:proofErr w:type="spellStart"/>
+      <w:r>
+        <w:rPr>
+          <w:rFonts w:hint="cs"/>
+        </w:rPr>
+        <w:t>צאיג</w:t>
+      </w:r>
+      <w:proofErr w:type="spellEnd"/>
+      <w:r>
+        <w:rPr>
+          <w:rFonts w:hint="cs"/>
+        </w:rPr>
+        <w:t xml:space="preserve"> | נעה גרוס</w:t>
       </w:r>
     </w:p>
     <w:p>
@@ -4233,6 +4247,7 @@
         <w:spacing w:after="120"/>
         <w:rPr>
           <w:rFonts w:cs="Segoe UI"/>
+          <w:rtl w:val="0"/>
         </w:rPr>
       </w:pPr>
       <w:r>
@@ -4290,6 +4305,31 @@
         </w:rPr>
         <w:t xml:space="preserve"> עבור נכס שלא שימש לאימון המודל. עם זאת, גם תחזיות אלה אינן מושלמות, ולכן יש להתייחס לקריטריון המחיר כאומדן ולא כמדד מוחלט.</w:t>
       </w:r>
+    </w:p>
+    <w:p>
+      <w:pPr>
+        <w:bidi w:val="0"/>
+        <w:rPr>
+          <w:rFonts w:cs="Segoe UI"/>
+          <w:rtl w:val="0"/>
+        </w:rPr>
+      </w:pPr>
+      <w:r>
+        <w:rPr>
+          <w:rFonts w:cs="Segoe UI"/>
+          <w:rtl w:val="0"/>
+        </w:rPr>
+        <w:br w:type="page"/>
+      </w:r>
+    </w:p>
+    <w:p>
+      <w:pPr>
+        <w:spacing w:after="120"/>
+        <w:rPr>
+          <w:rFonts w:cs="Segoe UI"/>
+          <w:rtl w:val="0"/>
+        </w:rPr>
+      </w:pPr>
     </w:p>
     <w:p>
       <w:pPr>
@@ -4450,7 +4490,6 @@
           <w:b/>
           <w:color w:val="0072B2"/>
         </w:rPr>
-        <w:lastRenderedPageBreak/>
         <w:t>השיטה:</w:t>
       </w:r>
     </w:p>
@@ -4491,19 +4530,7 @@
         <w:rPr>
           <w:rFonts w:cs="Segoe UI"/>
         </w:rPr>
-        <w:t xml:space="preserve"> (נכס אחד הוסר עקב נתון חסר). החלוקה התבססה על </w:t>
-      </w:r>
-      <w:r>
-        <w:rPr>
-          <w:rFonts w:cs="Segoe UI" w:hint="cs"/>
-        </w:rPr>
-        <w:t xml:space="preserve">חמישה </w:t>
-      </w:r>
-      <w:r>
-        <w:rPr>
-          <w:rFonts w:cs="Segoe UI"/>
-        </w:rPr>
-        <w:t>מאפיינים כמותיים: מיקום גיאוגרפי (קווי רוחב ואורך), קיבולת אורחים, מספר חדרי שינה ומספר שירותים (</w:t>
+        <w:t xml:space="preserve"> (נכס אחד הוסר עקב נתון חסר). החלוקה התבססה על חמישה מאפיינים כמותיים: מיקום גיאוגרפי (קווי רוחב ואורך), קיבולת אורחים, מספר חדרי שינה ומספר שירותים (</w:t>
       </w:r>
       <w:r>
         <w:rPr>
@@ -4530,7 +4557,7 @@
         <w:rPr>
           <w:rFonts w:cs="Segoe UI"/>
         </w:rPr>
-        <w:t xml:space="preserve">תחילה, ביצענו סטנדרטיזציה לכל המשתנים כדי להביאם לסולם אחיד. שלב זה קריטי, שכן </w:t>
+        <w:t xml:space="preserve">תחילה, ביצענו סטנדרטיזציה (נרמול הנתונים) לכל המשתנים כדי להביאם לסולם אחיד. שלב זה קריטי, שכן </w:t>
       </w:r>
       <w:r>
         <w:rPr>
@@ -4656,197 +4683,21 @@
       <w:r>
         <w:rPr>
           <w:rFonts w:cs="Segoe UI"/>
-        </w:rPr>
-        <w:t>את מספר האשכולות (</w:t>
-      </w:r>
-      <m:oMath>
-        <m:r>
-          <w:rPr>
-            <w:rFonts w:ascii="Cambria Math" w:hAnsi="Cambria Math" w:cs="Cambria Math" w:hint="cs"/>
-          </w:rPr>
-          <m:t>k</m:t>
-        </m:r>
-      </m:oMath>
-      <w:r>
-        <w:rPr>
-          <w:rFonts w:cs="Segoe UI"/>
-        </w:rPr>
-        <w:t>) קבענו באמצעות "שיטת המרפק" (Elbow Method). הרצנו את האלגוריתם עבור ערכי</w:t>
-      </w:r>
-      <w:r>
-        <w:rPr>
-          <w:rFonts w:cs="Segoe UI"/>
-          <w:rtl w:val="0"/>
-        </w:rPr>
-        <w:t xml:space="preserve"> </w:t>
-      </w:r>
-      <m:oMath>
-        <m:r>
-          <w:rPr>
-            <w:rFonts w:ascii="Cambria Math" w:hAnsi="Cambria Math" w:cs="Cambria Math" w:hint="cs"/>
-          </w:rPr>
-          <m:t>k</m:t>
-        </m:r>
-        <m:r>
-          <w:rPr>
-            <w:rFonts w:ascii="Cambria Math" w:hAnsi="Cambria Math" w:cs="Cambria Math"/>
-            <w:rtl w:val="0"/>
-          </w:rPr>
-          <m:t xml:space="preserve"> </m:t>
-        </m:r>
-      </m:oMath>
-      <w:r>
-        <w:rPr>
-          <w:rFonts w:cs="Segoe UI"/>
-        </w:rPr>
-        <w:t xml:space="preserve"> בין 1 ל-7, וחישבנו לכל הרצה את מדד ה-SSE (סכום ריבועי המרחקים של הנכסים מ</w:t>
-      </w:r>
-      <w:r>
-        <w:rPr>
-          <w:rFonts w:cs="Segoe UI" w:hint="cs"/>
-        </w:rPr>
-        <w:t>מ</w:t>
-      </w:r>
-      <w:r>
-        <w:rPr>
-          <w:rFonts w:cs="Segoe UI"/>
-        </w:rPr>
-        <w:t xml:space="preserve">רכזי </w:t>
-      </w:r>
-      <w:r>
-        <w:rPr>
-          <w:rFonts w:cs="Segoe UI" w:hint="cs"/>
-        </w:rPr>
-        <w:t>ה</w:t>
-      </w:r>
-      <w:r>
-        <w:rPr>
-          <w:rFonts w:cs="Segoe UI"/>
-        </w:rPr>
-        <w:t>קבוצות שלהם). הערך</w:t>
-      </w:r>
-      <w:r>
-        <w:rPr>
-          <w:rFonts w:cs="Segoe UI"/>
-          <w:rtl w:val="0"/>
-        </w:rPr>
-        <w:t xml:space="preserve"> </w:t>
-      </w:r>
-      <m:oMath>
-        <m:r>
-          <w:rPr>
-            <w:rFonts w:ascii="Cambria Math" w:hAnsi="Cambria Math" w:cs="Cambria Math" w:hint="cs"/>
-          </w:rPr>
-          <m:t>k</m:t>
-        </m:r>
-        <m:r>
-          <m:rPr>
-            <m:sty m:val="p"/>
-          </m:rPr>
-          <w:rPr>
-            <w:rFonts w:ascii="Cambria Math" w:hAnsi="Cambria Math" w:cs="Segoe UI"/>
-          </w:rPr>
-          <m:t>=1</m:t>
-        </m:r>
-      </m:oMath>
-      <w:r>
-        <w:rPr>
-          <w:rFonts w:cs="Segoe UI"/>
-        </w:rPr>
-        <w:t xml:space="preserve"> נכלל בניתוח בכוונה כדי לשמש כקו בסיס, שכן ה-SSE שלו מייצג את הפיזור הכולל והטבעי של הנתונים ללא כל חלוקה.</w:t>
-      </w:r>
-    </w:p>
-    <w:p>
-      <w:pPr>
-        <w:spacing w:after="120"/>
-        <w:rPr>
-          <w:rFonts w:cs="Segoe UI"/>
-        </w:rPr>
-      </w:pPr>
-      <w:r>
-        <w:rPr>
-          <w:rFonts w:cs="Segoe UI"/>
-        </w:rPr>
-        <w:t xml:space="preserve">האיור הראשון מציג את ירידת ה-SSE ככל שמספר האשכולות גדל. הירידה תלולה בתחילה – מ-2,260 (ללא חלוקה כלל), ל-1,739 (שתי קבוצות), ול-1,281 (שלוש קבוצות) </w:t>
-      </w:r>
-      <w:r>
-        <w:rPr>
-          <w:rFonts w:cs="Segoe UI" w:hint="cs"/>
-        </w:rPr>
-        <w:t>-</w:t>
-      </w:r>
-      <w:r>
-        <w:rPr>
-          <w:rFonts w:cs="Segoe UI"/>
-        </w:rPr>
-        <w:t xml:space="preserve"> ומשם ואילך העקומה מתיישרת בהדרגה. "נקודת המרפק", כלומר הנקודה שבה נעצרת הירידה התלולה, נמצאת ב-</w:t>
-      </w:r>
-      <m:oMath>
-        <m:r>
-          <w:rPr>
-            <w:rFonts w:ascii="Cambria Math" w:hAnsi="Cambria Math" w:cs="Cambria Math" w:hint="cs"/>
-          </w:rPr>
-          <m:t>k</m:t>
-        </m:r>
-        <m:r>
-          <w:rPr>
-            <w:rFonts w:ascii="Cambria Math" w:hAnsi="Cambria Math" w:cs="Segoe UI"/>
-          </w:rPr>
-          <m:t>=3</m:t>
-        </m:r>
-      </m:oMath>
-      <w:r>
-        <w:rPr>
-          <w:rFonts w:cs="Segoe UI"/>
-        </w:rPr>
-        <w:t>. כדי לגבות זאת מתמטית ולא להסתמך רק על מראה עיניים, בחנו את עקמומיות העקומה (המחושבת כהפרש השני של ה-SSE): ב-</w:t>
-      </w:r>
-      <m:oMath>
-        <m:r>
-          <w:rPr>
-            <w:rFonts w:ascii="Cambria Math" w:hAnsi="Cambria Math" w:cs="Cambria Math" w:hint="cs"/>
-          </w:rPr>
-          <m:t>k</m:t>
-        </m:r>
-        <m:r>
-          <w:rPr>
-            <w:rFonts w:ascii="Cambria Math" w:hAnsi="Cambria Math" w:cs="Segoe UI"/>
-          </w:rPr>
-          <m:t>=3</m:t>
-        </m:r>
-      </m:oMath>
-      <w:r>
-        <w:rPr>
-          <w:rFonts w:cs="Segoe UI"/>
-        </w:rPr>
-        <w:t xml:space="preserve"> מגיע המדד לערך של 250.6, הגבוה פי ארבעה מכל נקודה אחרת על הגרף (לשם השוואה, הערכים הבאים נעים בין 17.9 ל-66.0).</w:t>
-      </w:r>
-    </w:p>
-    <w:p>
-      <w:pPr>
-        <w:spacing w:after="120"/>
-        <w:rPr>
-          <w:rFonts w:cs="Segoe UI"/>
-        </w:rPr>
-      </w:pPr>
-      <w:r>
-        <w:rPr>
-          <w:rFonts w:cs="Segoe UI"/>
           <w:noProof/>
           <w:rtl w:val="0"/>
         </w:rPr>
         <w:drawing>
-          <wp:anchor distT="0" distB="0" distL="114300" distR="114300" simplePos="0" relativeHeight="251660288" behindDoc="0" locked="0" layoutInCell="1" allowOverlap="1" wp14:anchorId="138A7841" wp14:editId="335A679E">
+          <wp:anchor distT="0" distB="0" distL="114300" distR="114300" simplePos="0" relativeHeight="251665408" behindDoc="0" locked="0" layoutInCell="1" allowOverlap="1" wp14:anchorId="0CB09A41" wp14:editId="6E1A5B72">
             <wp:simplePos x="0" y="0"/>
             <wp:positionH relativeFrom="margin">
-              <wp:posOffset>373628</wp:posOffset>
+              <wp:posOffset>1052830</wp:posOffset>
             </wp:positionH>
             <wp:positionV relativeFrom="paragraph">
-              <wp:posOffset>11319</wp:posOffset>
+              <wp:posOffset>444500</wp:posOffset>
             </wp:positionV>
             <wp:extent cx="4216400" cy="2527935"/>
             <wp:effectExtent l="0" t="0" r="0" b="5715"/>
-            <wp:wrapSquare wrapText="bothSides"/>
+            <wp:wrapTopAndBottom/>
             <wp:docPr id="149677165" name="תמונה 1"/>
             <wp:cNvGraphicFramePr>
               <a:graphicFrameLocks xmlns:a="http://schemas.openxmlformats.org/drawingml/2006/main" noChangeAspect="1"/>
@@ -4898,6 +4749,113 @@
           </wp:anchor>
         </w:drawing>
       </w:r>
+      <w:r>
+        <w:rPr>
+          <w:rFonts w:cs="Segoe UI"/>
+        </w:rPr>
+        <w:t>את מספר האשכולות (</w:t>
+      </w:r>
+      <m:oMath>
+        <m:r>
+          <w:rPr>
+            <w:rFonts w:ascii="Cambria Math" w:hAnsi="Cambria Math" w:cs="Cambria Math" w:hint="cs"/>
+          </w:rPr>
+          <m:t>k</m:t>
+        </m:r>
+      </m:oMath>
+      <w:r>
+        <w:rPr>
+          <w:rFonts w:cs="Segoe UI"/>
+        </w:rPr>
+        <w:t>) קבענו באמצעות "שיטת המרפק" (Elbow Method). הרצנו את האלגוריתם עבור ערכי</w:t>
+      </w:r>
+      <w:r>
+        <w:rPr>
+          <w:rFonts w:cs="Segoe UI"/>
+          <w:rtl w:val="0"/>
+        </w:rPr>
+        <w:t xml:space="preserve"> </w:t>
+      </w:r>
+      <m:oMath>
+        <m:r>
+          <w:rPr>
+            <w:rFonts w:ascii="Cambria Math" w:hAnsi="Cambria Math" w:cs="Cambria Math" w:hint="cs"/>
+          </w:rPr>
+          <m:t>k</m:t>
+        </m:r>
+      </m:oMath>
+      <w:r>
+        <w:rPr>
+          <w:rFonts w:cs="Segoe UI"/>
+        </w:rPr>
+        <w:t xml:space="preserve"> בין 1 ל-7, וחישבנו לכל הרצה את מדד ה-SSE (סכום ריבועי המרחקים של הנכסים מ</w:t>
+      </w:r>
+      <w:r>
+        <w:rPr>
+          <w:rFonts w:cs="Segoe UI" w:hint="cs"/>
+        </w:rPr>
+        <w:t>מ</w:t>
+      </w:r>
+      <w:r>
+        <w:rPr>
+          <w:rFonts w:cs="Segoe UI"/>
+        </w:rPr>
+        <w:t xml:space="preserve">רכזי </w:t>
+      </w:r>
+      <w:r>
+        <w:rPr>
+          <w:rFonts w:cs="Segoe UI" w:hint="cs"/>
+        </w:rPr>
+        <w:t>ה</w:t>
+      </w:r>
+      <w:r>
+        <w:rPr>
+          <w:rFonts w:cs="Segoe UI"/>
+        </w:rPr>
+        <w:t>קבוצות שלהם).</w:t>
+      </w:r>
+      <w:r>
+        <w:rPr>
+          <w:rFonts w:cs="Segoe UI"/>
+        </w:rPr>
+        <w:br/>
+      </w:r>
+      <w:r>
+        <w:rPr>
+          <w:rFonts w:cs="Segoe UI"/>
+        </w:rPr>
+        <w:t>הערך</w:t>
+      </w:r>
+      <w:r>
+        <w:rPr>
+          <w:rFonts w:cs="Segoe UI"/>
+          <w:rtl w:val="0"/>
+        </w:rPr>
+        <w:t xml:space="preserve"> </w:t>
+      </w:r>
+      <m:oMath>
+        <m:r>
+          <w:rPr>
+            <w:rFonts w:ascii="Cambria Math" w:hAnsi="Cambria Math" w:cs="Cambria Math" w:hint="cs"/>
+          </w:rPr>
+          <m:t>k</m:t>
+        </m:r>
+        <m:r>
+          <m:rPr>
+            <m:sty m:val="p"/>
+          </m:rPr>
+          <w:rPr>
+            <w:rFonts w:ascii="Cambria Math" w:hAnsi="Cambria Math" w:cs="Segoe UI"/>
+          </w:rPr>
+          <m:t>=1</m:t>
+        </m:r>
+      </m:oMath>
+      <w:r>
+        <w:rPr>
+          <w:rFonts w:cs="Segoe UI"/>
+        </w:rPr>
+        <w:t xml:space="preserve"> נכלל בניתוח בכוונה כדי לשמש כקו בסיס, שכן ה-SSE שלו מייצג את הפיזור הכולל והטבעי של הנתונים ללא כל חלוקה.</w:t>
+      </w:r>
     </w:p>
     <w:p>
       <w:pPr>
@@ -4906,62 +4864,52 @@
           <w:rFonts w:cs="Segoe UI"/>
         </w:rPr>
       </w:pPr>
-    </w:p>
-    <w:p>
-      <w:pPr>
-        <w:spacing w:after="120"/>
-        <w:rPr>
-          <w:rFonts w:cs="Segoe UI"/>
-        </w:rPr>
-      </w:pPr>
-    </w:p>
-    <w:p>
-      <w:pPr>
-        <w:spacing w:after="120"/>
-        <w:rPr>
-          <w:rFonts w:cs="Segoe UI"/>
-        </w:rPr>
-      </w:pPr>
-    </w:p>
-    <w:p>
-      <w:pPr>
-        <w:spacing w:after="120"/>
-        <w:rPr>
-          <w:rFonts w:cs="Segoe UI"/>
-        </w:rPr>
-      </w:pPr>
-    </w:p>
-    <w:p>
-      <w:pPr>
-        <w:spacing w:after="120"/>
-        <w:rPr>
-          <w:rFonts w:cs="Segoe UI"/>
-        </w:rPr>
-      </w:pPr>
-    </w:p>
-    <w:p>
-      <w:pPr>
-        <w:spacing w:after="120"/>
-        <w:rPr>
-          <w:rFonts w:cs="Segoe UI"/>
-        </w:rPr>
-      </w:pPr>
-    </w:p>
-    <w:p>
-      <w:pPr>
-        <w:spacing w:after="120"/>
-        <w:rPr>
-          <w:rFonts w:cs="Segoe UI"/>
-        </w:rPr>
-      </w:pPr>
-    </w:p>
-    <w:p>
-      <w:pPr>
-        <w:spacing w:after="120"/>
-        <w:rPr>
-          <w:rFonts w:cs="Segoe UI"/>
-        </w:rPr>
-      </w:pPr>
+      <w:r>
+        <w:rPr>
+          <w:rFonts w:cs="Segoe UI"/>
+        </w:rPr>
+        <w:t>האיור הראשון מציג את ירידת ה-SSE ככל שמספר האשכולות גדל. הירידה תלולה בתחילה – מ-2,260 (ללא חלוקה כלל), ל-1,739 (שתי קבוצות), ול-1,281 (שלוש קבוצות) – ומשם ואילך העקומה מתיישרת בהדרגה. "נקודת המרפק", כלומר הנקודה שבה נעצרת הירידה התלולה, נמצאת ב-</w:t>
+      </w:r>
+      <m:oMath>
+        <m:r>
+          <w:rPr>
+            <w:rFonts w:ascii="Cambria Math" w:hAnsi="Cambria Math" w:cs="Cambria Math" w:hint="cs"/>
+          </w:rPr>
+          <m:t>k</m:t>
+        </m:r>
+        <m:r>
+          <w:rPr>
+            <w:rFonts w:ascii="Cambria Math" w:hAnsi="Cambria Math" w:cs="Segoe UI"/>
+          </w:rPr>
+          <m:t>=3</m:t>
+        </m:r>
+      </m:oMath>
+      <w:r>
+        <w:rPr>
+          <w:rFonts w:cs="Segoe UI"/>
+        </w:rPr>
+        <w:t>. כדי לגבות זאת מתמטית ולא להסתמך רק על מראה עיניים, בחנו את עקמומיות העקומה (המחושבת כהפרש השני של ה-SSE): ב-</w:t>
+      </w:r>
+      <m:oMath>
+        <m:r>
+          <w:rPr>
+            <w:rFonts w:ascii="Cambria Math" w:hAnsi="Cambria Math" w:cs="Cambria Math" w:hint="cs"/>
+          </w:rPr>
+          <m:t>k</m:t>
+        </m:r>
+        <m:r>
+          <w:rPr>
+            <w:rFonts w:ascii="Cambria Math" w:hAnsi="Cambria Math" w:cs="Segoe UI"/>
+          </w:rPr>
+          <m:t>=3</m:t>
+        </m:r>
+      </m:oMath>
+      <w:r>
+        <w:rPr>
+          <w:rFonts w:cs="Segoe UI"/>
+        </w:rPr>
+        <w:t xml:space="preserve"> מגיע המדד לערך של 250.6, הגבוה פי ארבעה מכל נקודה אחרת על הגרף (לשם השוואה, הערכים הבאים נעים בין 17.9 ל-66.0).</w:t>
+      </w:r>
     </w:p>
     <w:p>
       <w:pPr>
@@ -4997,7 +4945,14 @@
         <w:rPr>
           <w:rFonts w:cs="Segoe UI"/>
         </w:rPr>
-        <w:t>, שזהו השיפור הגדול ביותר), צונח ל-16.2% במעבר לארבע קבוצות, ומשם ממשיך לרדת לאזורים זניחים יותר (13.2% ומטה). תצוגה זו הופכת את השאלה "היכן העקומה מתיישרת" מרושם ויזואלי למספר שניתן לכמת.</w:t>
+        <w:t xml:space="preserve">, שזהו השיפור הגדול ביותר), צונח ל-16.2% במעבר לארבע קבוצות, ומשם ממשיך </w:t>
+      </w:r>
+      <w:r>
+        <w:rPr>
+          <w:rFonts w:cs="Segoe UI"/>
+        </w:rPr>
+        <w:lastRenderedPageBreak/>
+        <w:t>לרדת לאזורים זניחים יותר (13.2% ומטה). תצוגה זו הופכת את השאלה "היכן העקומה מתיישרת" מרושם ויזואלי למספר שניתן לכמת.</w:t>
       </w:r>
     </w:p>
     <w:p>
@@ -5005,6 +4960,101 @@
         <w:spacing w:after="120"/>
         <w:rPr>
           <w:rFonts w:cs="Segoe UI"/>
+          <w:b/>
+          <w:bCs/>
+          <w:rtl w:val="0"/>
+        </w:rPr>
+      </w:pPr>
+      <w:r>
+        <w:rPr>
+          <w:rFonts w:cs="Segoe UI"/>
+          <w:b/>
+          <w:bCs/>
+        </w:rPr>
+        <w:t>ההחלטה לחרוג מנקודת המרפק:</w:t>
+      </w:r>
+    </w:p>
+    <w:p>
+      <w:pPr>
+        <w:spacing w:after="120"/>
+        <w:rPr>
+          <w:rFonts w:cs="Segoe UI"/>
+        </w:rPr>
+      </w:pPr>
+      <w:r>
+        <w:rPr>
+          <w:rFonts w:cs="Segoe UI"/>
+        </w:rPr>
+        <w:t>אף שהמדד הכמותי מצביע על שלוש קבוצות, בחרנו לחלק את הנתונים ל-4 קבוצות. חריגה מודעת זו נעשתה מטעמי פרשנות עסקית, ונשענת על שני נימוקים:</w:t>
+      </w:r>
+    </w:p>
+    <w:p>
+      <w:pPr>
+        <w:pStyle w:val="ae"/>
+        <w:numPr>
+          <w:ilvl w:val="0"/>
+          <w:numId w:val="18"/>
+        </w:numPr>
+        <w:tabs>
+          <w:tab w:val="num" w:pos="720"/>
+        </w:tabs>
+        <w:spacing w:after="120"/>
+        <w:rPr>
+          <w:rFonts w:cs="Segoe UI"/>
+          <w:rtl w:val="0"/>
+        </w:rPr>
+      </w:pPr>
+      <w:r>
+        <w:rPr>
+          <w:rFonts w:cs="Segoe UI"/>
+          <w:u w:val="single"/>
+        </w:rPr>
+        <w:t>הצדקה כמותית</w:t>
+      </w:r>
+      <w:r>
+        <w:rPr>
+          <w:rFonts w:cs="Segoe UI"/>
+        </w:rPr>
+        <w:t>: האשכול הרביעי עדיין מסיר 16.2% מהשגיאה הנותרת – שיפור שאינו זניח. צניחה לשיפורים שוליים באמת מתרחשת רק החל מ-</w:t>
+      </w:r>
+      <m:oMath>
+        <m:r>
+          <w:rPr>
+            <w:rFonts w:ascii="Cambria Math" w:hAnsi="Cambria Math" w:cs="Cambria Math" w:hint="cs"/>
+          </w:rPr>
+          <m:t>k</m:t>
+        </m:r>
+        <m:r>
+          <m:rPr>
+            <m:sty m:val="p"/>
+          </m:rPr>
+          <w:rPr>
+            <w:rFonts w:ascii="Cambria Math" w:hAnsi="Cambria Math" w:cs="Segoe UI"/>
+          </w:rPr>
+          <m:t>=5</m:t>
+        </m:r>
+      </m:oMath>
+      <w:r>
+        <w:rPr>
+          <w:rFonts w:cs="Segoe UI"/>
+        </w:rPr>
+        <w:t>.</w:t>
+      </w:r>
+    </w:p>
+    <w:p>
+      <w:pPr>
+        <w:pStyle w:val="ae"/>
+        <w:numPr>
+          <w:ilvl w:val="0"/>
+          <w:numId w:val="18"/>
+        </w:numPr>
+        <w:tabs>
+          <w:tab w:val="num" w:pos="720"/>
+        </w:tabs>
+        <w:spacing w:after="120"/>
+        <w:rPr>
+          <w:rFonts w:cs="Segoe UI"/>
+          <w:rtl w:val="0"/>
         </w:rPr>
       </w:pPr>
       <w:r>
@@ -5013,19 +5063,18 @@
           <w:noProof/>
           <w:rtl w:val="0"/>
         </w:rPr>
-        <w:lastRenderedPageBreak/>
         <w:drawing>
-          <wp:anchor distT="0" distB="0" distL="114300" distR="114300" simplePos="0" relativeHeight="251661312" behindDoc="0" locked="0" layoutInCell="1" allowOverlap="1" wp14:anchorId="141C4DF0" wp14:editId="02291E42">
+          <wp:anchor distT="0" distB="0" distL="114300" distR="114300" simplePos="0" relativeHeight="251666432" behindDoc="0" locked="0" layoutInCell="1" allowOverlap="1" wp14:anchorId="04330839" wp14:editId="34CF2416">
             <wp:simplePos x="0" y="0"/>
             <wp:positionH relativeFrom="page">
-              <wp:posOffset>1986694</wp:posOffset>
+              <wp:posOffset>1656244</wp:posOffset>
             </wp:positionH>
             <wp:positionV relativeFrom="paragraph">
-              <wp:posOffset>120539</wp:posOffset>
+              <wp:posOffset>687265</wp:posOffset>
             </wp:positionV>
-            <wp:extent cx="4297680" cy="2360930"/>
-            <wp:effectExtent l="0" t="0" r="7620" b="1270"/>
-            <wp:wrapSquare wrapText="bothSides"/>
+            <wp:extent cx="4900930" cy="2692400"/>
+            <wp:effectExtent l="0" t="0" r="0" b="0"/>
+            <wp:wrapTopAndBottom/>
             <wp:docPr id="481284050" name="תמונה 2"/>
             <wp:cNvGraphicFramePr>
               <a:graphicFrameLocks xmlns:a="http://schemas.openxmlformats.org/drawingml/2006/main" noChangeAspect="1"/>
@@ -5055,7 +5104,7 @@
                   <pic:spPr bwMode="auto">
                     <a:xfrm>
                       <a:off x="0" y="0"/>
-                      <a:ext cx="4297680" cy="2360930"/>
+                      <a:ext cx="4900930" cy="2692400"/>
                     </a:xfrm>
                     <a:prstGeom prst="rect">
                       <a:avLst/>
@@ -5077,173 +5126,6 @@
           </wp:anchor>
         </w:drawing>
       </w:r>
-    </w:p>
-    <w:p>
-      <w:pPr>
-        <w:spacing w:after="120"/>
-        <w:rPr>
-          <w:rFonts w:cs="Segoe UI"/>
-        </w:rPr>
-      </w:pPr>
-    </w:p>
-    <w:p>
-      <w:pPr>
-        <w:spacing w:after="120"/>
-        <w:rPr>
-          <w:rFonts w:cs="Segoe UI"/>
-        </w:rPr>
-      </w:pPr>
-    </w:p>
-    <w:p>
-      <w:pPr>
-        <w:spacing w:after="120"/>
-        <w:rPr>
-          <w:rFonts w:cs="Segoe UI"/>
-        </w:rPr>
-      </w:pPr>
-    </w:p>
-    <w:p>
-      <w:pPr>
-        <w:spacing w:after="120"/>
-        <w:rPr>
-          <w:rFonts w:cs="Segoe UI"/>
-        </w:rPr>
-      </w:pPr>
-    </w:p>
-    <w:p>
-      <w:pPr>
-        <w:spacing w:after="120"/>
-        <w:rPr>
-          <w:rFonts w:cs="Segoe UI"/>
-        </w:rPr>
-      </w:pPr>
-    </w:p>
-    <w:p>
-      <w:pPr>
-        <w:spacing w:after="120"/>
-        <w:rPr>
-          <w:rFonts w:cs="Segoe UI"/>
-        </w:rPr>
-      </w:pPr>
-    </w:p>
-    <w:p>
-      <w:pPr>
-        <w:spacing w:after="120"/>
-        <w:rPr>
-          <w:rFonts w:cs="Segoe UI"/>
-        </w:rPr>
-      </w:pPr>
-    </w:p>
-    <w:p>
-      <w:pPr>
-        <w:spacing w:after="120"/>
-        <w:rPr>
-          <w:rFonts w:cs="Segoe UI"/>
-        </w:rPr>
-      </w:pPr>
-    </w:p>
-    <w:p>
-      <w:pPr>
-        <w:spacing w:after="120"/>
-        <w:rPr>
-          <w:rFonts w:cs="Segoe UI"/>
-          <w:b/>
-          <w:bCs/>
-          <w:rtl w:val="0"/>
-        </w:rPr>
-      </w:pPr>
-      <w:r>
-        <w:rPr>
-          <w:rFonts w:cs="Segoe UI"/>
-          <w:b/>
-          <w:bCs/>
-        </w:rPr>
-        <w:t>ההחלטה לחרוג מנקודת המרפק:</w:t>
-      </w:r>
-    </w:p>
-    <w:p>
-      <w:pPr>
-        <w:spacing w:after="120"/>
-        <w:rPr>
-          <w:rFonts w:cs="Segoe UI"/>
-        </w:rPr>
-      </w:pPr>
-      <w:r>
-        <w:rPr>
-          <w:rFonts w:cs="Segoe UI"/>
-        </w:rPr>
-        <w:t>אף שהמדד הכמותי מצביע על שלוש קבוצות, בחרנו לחלק את הנתונים ל-4 קבוצות. חריגה מודעת זו נעשתה מטעמי פרשנות עסקית, ונשענת על שני נימוקים:</w:t>
-      </w:r>
-    </w:p>
-    <w:p>
-      <w:pPr>
-        <w:pStyle w:val="ae"/>
-        <w:numPr>
-          <w:ilvl w:val="0"/>
-          <w:numId w:val="18"/>
-        </w:numPr>
-        <w:tabs>
-          <w:tab w:val="num" w:pos="720"/>
-        </w:tabs>
-        <w:spacing w:after="120"/>
-        <w:rPr>
-          <w:rFonts w:cs="Segoe UI"/>
-          <w:rtl w:val="0"/>
-        </w:rPr>
-      </w:pPr>
-      <w:r>
-        <w:rPr>
-          <w:rFonts w:cs="Segoe UI"/>
-          <w:u w:val="single"/>
-        </w:rPr>
-        <w:t>הצדקה כמותית</w:t>
-      </w:r>
-      <w:r>
-        <w:rPr>
-          <w:rFonts w:cs="Segoe UI"/>
-        </w:rPr>
-        <w:t>: האשכול הרביעי עדיין מסיר 16.2% מהשגיאה הנותרת – שיפור שאינו זניח. צניחה לשיפורים שוליים באמת מתרחשת רק החל מ-</w:t>
-      </w:r>
-      <m:oMath>
-        <m:r>
-          <w:rPr>
-            <w:rFonts w:ascii="Cambria Math" w:hAnsi="Cambria Math" w:cs="Cambria Math" w:hint="cs"/>
-          </w:rPr>
-          <m:t>k</m:t>
-        </m:r>
-        <m:r>
-          <m:rPr>
-            <m:sty m:val="p"/>
-          </m:rPr>
-          <w:rPr>
-            <w:rFonts w:ascii="Cambria Math" w:hAnsi="Cambria Math" w:cs="Segoe UI"/>
-          </w:rPr>
-          <m:t>=5</m:t>
-        </m:r>
-      </m:oMath>
-      <w:r>
-        <w:rPr>
-          <w:rFonts w:cs="Segoe UI"/>
-        </w:rPr>
-        <w:t>.</w:t>
-      </w:r>
-    </w:p>
-    <w:p>
-      <w:pPr>
-        <w:pStyle w:val="ae"/>
-        <w:numPr>
-          <w:ilvl w:val="0"/>
-          <w:numId w:val="18"/>
-        </w:numPr>
-        <w:tabs>
-          <w:tab w:val="num" w:pos="720"/>
-        </w:tabs>
-        <w:spacing w:after="120"/>
-        <w:rPr>
-          <w:rFonts w:cs="Segoe UI"/>
-          <w:rtl w:val="0"/>
-        </w:rPr>
-      </w:pPr>
       <w:r>
         <w:rPr>
           <w:rFonts w:cs="Segoe UI"/>
@@ -5311,7 +5193,6 @@
           <w:rFonts w:cs="Segoe UI"/>
           <w:b/>
           <w:color w:val="0072B2"/>
-          <w:rtl w:val="0"/>
         </w:rPr>
       </w:pPr>
       <w:r>
@@ -5325,13 +5206,18 @@
     </w:p>
     <w:p>
       <w:pPr>
-        <w:spacing w:after="120"/>
-      </w:pPr>
-      <w:r>
         <w:rPr>
           <w:rFonts w:cs="Segoe UI"/>
           <w:b/>
           <w:color w:val="0072B2"/>
+          <w:rtl w:val="0"/>
+        </w:rPr>
+      </w:pPr>
+      <w:r>
+        <w:rPr>
+          <w:rFonts w:cs="Segoe UI"/>
+          <w:b/>
+          <w:color w:val="0072B2"/>
         </w:rPr>
         <w:lastRenderedPageBreak/>
         <w:t>תוצאות:</w:t>
@@ -5347,52 +5233,373 @@
       <w:r>
         <w:rPr>
           <w:rFonts w:cs="Segoe UI"/>
-        </w:rPr>
-        <w:t xml:space="preserve"> </w:t>
-      </w:r>
-      <w:r>
-        <w:rPr>
-          <w:rFonts w:cs="Segoe UI"/>
-        </w:rPr>
-        <w:t>ניתוח הקבוצות מעלה ממצא מעניין: חלוקת נכסי ה-</w:t>
-      </w:r>
-      <w:r>
-        <w:rPr>
-          <w:rFonts w:cs="Segoe UI"/>
+          <w:noProof/>
           <w:rtl w:val="0"/>
         </w:rPr>
+        <w:drawing>
+          <wp:anchor distT="0" distB="0" distL="114300" distR="114300" simplePos="0" relativeHeight="251668480" behindDoc="0" locked="0" layoutInCell="1" allowOverlap="1" wp14:anchorId="3D7D0772" wp14:editId="597C7AAA">
+            <wp:simplePos x="0" y="0"/>
+            <wp:positionH relativeFrom="margin">
+              <wp:posOffset>405102</wp:posOffset>
+            </wp:positionH>
+            <wp:positionV relativeFrom="paragraph">
+              <wp:posOffset>725832</wp:posOffset>
+            </wp:positionV>
+            <wp:extent cx="6130925" cy="6997065"/>
+            <wp:effectExtent l="0" t="0" r="3175" b="0"/>
+            <wp:wrapTopAndBottom/>
+            <wp:docPr id="312886264" name="תמונה 1"/>
+            <wp:cNvGraphicFramePr>
+              <a:graphicFrameLocks xmlns:a="http://schemas.openxmlformats.org/drawingml/2006/main" noChangeAspect="1"/>
+            </wp:cNvGraphicFramePr>
+            <a:graphic xmlns:a="http://schemas.openxmlformats.org/drawingml/2006/main">
+              <a:graphicData uri="http://schemas.openxmlformats.org/drawingml/2006/picture">
+                <pic:pic xmlns:pic="http://schemas.openxmlformats.org/drawingml/2006/picture">
+                  <pic:nvPicPr>
+                    <pic:cNvPr id="0" name="Picture 1"/>
+                    <pic:cNvPicPr>
+                      <a:picLocks noChangeAspect="1" noChangeArrowheads="1"/>
+                    </pic:cNvPicPr>
+                  </pic:nvPicPr>
+                  <pic:blipFill>
+                    <a:blip r:embed="rId12">
+                      <a:extLst>
+                        <a:ext uri="{28A0092B-C50C-407E-A947-70E740481C1C}">
+                          <a14:useLocalDpi xmlns:a14="http://schemas.microsoft.com/office/drawing/2010/main" val="0"/>
+                        </a:ext>
+                      </a:extLst>
+                    </a:blip>
+                    <a:srcRect/>
+                    <a:stretch>
+                      <a:fillRect/>
+                    </a:stretch>
+                  </pic:blipFill>
+                  <pic:spPr bwMode="auto">
+                    <a:xfrm>
+                      <a:off x="0" y="0"/>
+                      <a:ext cx="6130925" cy="6997065"/>
+                    </a:xfrm>
+                    <a:prstGeom prst="rect">
+                      <a:avLst/>
+                    </a:prstGeom>
+                    <a:noFill/>
+                    <a:ln>
+                      <a:noFill/>
+                    </a:ln>
+                  </pic:spPr>
+                </pic:pic>
+              </a:graphicData>
+            </a:graphic>
+            <wp14:sizeRelH relativeFrom="page">
+              <wp14:pctWidth>0</wp14:pctWidth>
+            </wp14:sizeRelH>
+            <wp14:sizeRelV relativeFrom="page">
+              <wp14:pctHeight>0</wp14:pctHeight>
+            </wp14:sizeRelV>
+          </wp:anchor>
+        </w:drawing>
+      </w:r>
+      <w:r>
+        <w:rPr>
+          <w:rFonts w:cs="Segoe UI" w:hint="cs"/>
+        </w:rPr>
+        <w:t>נ</w:t>
+      </w:r>
+      <w:r>
+        <w:rPr>
+          <w:rFonts w:cs="Segoe UI"/>
+        </w:rPr>
+        <w:t>יתוח הקבוצות מעלה כי חלוקת נכסי ה-</w:t>
+      </w:r>
+      <w:r>
+        <w:rPr>
+          <w:rFonts w:cs="Segoe UI"/>
+          <w:rtl w:val="0"/>
+        </w:rPr>
         <w:t>Hidden Gems</w:t>
       </w:r>
       <w:r>
         <w:rPr>
           <w:rFonts w:cs="Segoe UI"/>
         </w:rPr>
-        <w:t xml:space="preserve"> מושפעת בעיקר ממאפייני הנכס עצמו (גודל ורמת אבזור) ופחות ממיקומו.</w:t>
+        <w:t xml:space="preserve"> מושפעת בעיקר ממאפייני הנכס (גודל ואבזור) ופחות ממיקומו. בפועל, שלוש מארבע הקבוצות מרוכזות באותו אזור במרכז רומא (פחות מקילומטר בין מרכזיהן), ורק הקבוצה הרביעית מובחנת גיאוגרפית וממוקמת באזור החוף (מרוחקת כ-21 ק"מ משאר הנכסים)</w:t>
+      </w:r>
+      <w:r>
+        <w:rPr>
+          <w:rFonts w:cs="Segoe UI" w:hint="cs"/>
+        </w:rPr>
+        <w:t>.</w:t>
+      </w:r>
+    </w:p>
+    <w:p>
+      <w:pPr>
+        <w:spacing w:after="120"/>
+        <w:rPr>
+          <w:rFonts w:cs="Segoe UI"/>
+        </w:rPr>
+      </w:pPr>
+      <w:r>
+        <w:rPr>
+          <w:rFonts w:cs="Segoe UI"/>
+        </w:rPr>
+        <w:t xml:space="preserve">המספר בכל תא הוא ממוצע התכונה באשכול ביחידות המקוריות; הצבע מציג את מרחקו מנכס </w:t>
+      </w:r>
+      <w:r>
+        <w:rPr>
+          <w:rFonts w:cs="Segoe UI"/>
+          <w:rtl w:val="0"/>
+        </w:rPr>
+        <w:t>Hidden Gem</w:t>
+      </w:r>
+      <w:r>
+        <w:rPr>
+          <w:rFonts w:cs="Segoe UI"/>
+        </w:rPr>
+        <w:t xml:space="preserve"> טיפוסי. חמשת המשתנים העליונים הם אלה שעל בסיסם נבנו האשכולות, ושאר המשתנים לא הוזנו לאלגוריתם ומשמשים לאפיון בלבד.</w:t>
+      </w:r>
+    </w:p>
+    <w:p>
+      <w:pPr>
+        <w:spacing w:after="120"/>
+        <w:rPr>
+          <w:rFonts w:cs="Segoe UI"/>
+        </w:rPr>
+      </w:pPr>
+      <w:r>
+        <w:rPr>
+          <w:rFonts w:cs="Segoe UI"/>
+        </w:rPr>
+        <w:t>להלן המאפיינים המבדילים של ארבעת טיפוסי ה-</w:t>
+      </w:r>
+      <w:r>
+        <w:rPr>
+          <w:rFonts w:cs="Segoe UI"/>
+          <w:rtl w:val="0"/>
+        </w:rPr>
+        <w:t>Hidden Gems</w:t>
+      </w:r>
+      <w:r>
+        <w:rPr>
+          <w:rFonts w:cs="Segoe UI"/>
+        </w:rPr>
+        <w:t xml:space="preserve"> שזיהינו:</w:t>
+      </w:r>
+    </w:p>
+    <w:p>
+      <w:pPr>
+        <w:pStyle w:val="ae"/>
+        <w:numPr>
+          <w:ilvl w:val="0"/>
+          <w:numId w:val="20"/>
+        </w:numPr>
+        <w:spacing w:after="120"/>
+        <w:rPr>
+          <w:rFonts w:cs="Segoe UI"/>
+          <w:rtl w:val="0"/>
+        </w:rPr>
+      </w:pPr>
+      <w:r>
+        <w:rPr>
+          <w:rFonts w:cs="Segoe UI"/>
+          <w:u w:val="single"/>
+        </w:rPr>
+        <w:t>דירות קומפקטיות ובסיסיות</w:t>
+      </w:r>
+      <w:r>
+        <w:rPr>
+          <w:rFonts w:cs="Segoe UI" w:hint="cs"/>
+          <w:u w:val="single"/>
+        </w:rPr>
+        <w:t xml:space="preserve"> (3)</w:t>
+      </w:r>
+      <w:r>
+        <w:rPr>
+          <w:rFonts w:cs="Segoe UI"/>
+          <w:u w:val="single"/>
+        </w:rPr>
+        <w:t>:</w:t>
+      </w:r>
+      <w:r>
+        <w:rPr>
+          <w:rFonts w:cs="Segoe UI"/>
+        </w:rPr>
+        <w:t xml:space="preserve"> מתאפיינת ברמת אבזור מינימלית ובנוכחות בולטת של חדרים פרטיים במרכז העיר. הממצא המעניין כאן הוא שחרף הפרופיל הצנוע והבסיסי, נכסים אלו שומרים על שביעות רצון גבוהה מאוד בקרב האורחים.</w:t>
+      </w:r>
+    </w:p>
+    <w:p>
+      <w:pPr>
+        <w:pStyle w:val="ae"/>
+        <w:numPr>
+          <w:ilvl w:val="0"/>
+          <w:numId w:val="20"/>
+        </w:numPr>
+        <w:spacing w:after="120"/>
+        <w:rPr>
+          <w:rFonts w:cs="Segoe UI"/>
+          <w:rtl w:val="0"/>
+        </w:rPr>
+      </w:pPr>
+      <w:r>
+        <w:rPr>
+          <w:rFonts w:cs="Segoe UI"/>
+          <w:u w:val="single"/>
+        </w:rPr>
+        <w:lastRenderedPageBreak/>
+        <w:t>דירות מאובזרות היטב</w:t>
+      </w:r>
+      <w:r>
+        <w:rPr>
+          <w:rFonts w:cs="Segoe UI" w:hint="cs"/>
+          <w:u w:val="single"/>
+        </w:rPr>
+        <w:t xml:space="preserve"> (1)</w:t>
+      </w:r>
+      <w:r>
+        <w:rPr>
+          <w:rFonts w:cs="Segoe UI"/>
+          <w:u w:val="single"/>
+        </w:rPr>
+        <w:t>:</w:t>
+      </w:r>
+      <w:r>
+        <w:rPr>
+          <w:rFonts w:cs="Segoe UI"/>
+        </w:rPr>
+        <w:t xml:space="preserve"> הקבוצה הגדולה במדגם. מהווה למעשה חלופה משודרגת לקבוצה 3 – מיקום וקיבולת אורחים דומים, אך עם פי שניים שירותים ורוב מוחלט של דירות שלמות.</w:t>
+      </w:r>
+    </w:p>
+    <w:p>
+      <w:pPr>
+        <w:pStyle w:val="ae"/>
+        <w:numPr>
+          <w:ilvl w:val="0"/>
+          <w:numId w:val="20"/>
+        </w:numPr>
+        <w:spacing w:after="120"/>
+        <w:rPr>
+          <w:rFonts w:cs="Segoe UI"/>
+          <w:rtl w:val="0"/>
+        </w:rPr>
+      </w:pPr>
+      <w:r>
+        <w:rPr>
+          <w:rFonts w:cs="Segoe UI"/>
+          <w:u w:val="single"/>
+        </w:rPr>
+        <w:t>נכסים גדולים לקבוצות</w:t>
+      </w:r>
+      <w:r>
+        <w:rPr>
+          <w:rFonts w:cs="Segoe UI" w:hint="cs"/>
+          <w:u w:val="single"/>
+        </w:rPr>
+        <w:t xml:space="preserve"> (2)</w:t>
+      </w:r>
+      <w:r>
+        <w:rPr>
+          <w:rFonts w:cs="Segoe UI"/>
+          <w:u w:val="single"/>
+        </w:rPr>
+        <w:t>:</w:t>
+      </w:r>
+      <w:r>
+        <w:rPr>
+          <w:rFonts w:cs="Segoe UI"/>
+        </w:rPr>
+        <w:t xml:space="preserve"> אשכול טהור של דירות שלמות (100%) המיועדות לאירוח רב-משתתפים. הנקודה המרכזית באשכול זה היא כלכלית: למרות שאלו הנכסים היקרים ביותר ללילה, הם מספקים את החיסכון האבסולוטי הגדול ביותר ביורו לעומת תמחור השוק החזוי.</w:t>
+      </w:r>
+    </w:p>
+    <w:p>
+      <w:pPr>
+        <w:pStyle w:val="ae"/>
+        <w:numPr>
+          <w:ilvl w:val="0"/>
+          <w:numId w:val="20"/>
+        </w:numPr>
+        <w:spacing w:after="120"/>
+        <w:rPr>
+          <w:rFonts w:cs="Segoe UI"/>
+          <w:rtl w:val="0"/>
+        </w:rPr>
+      </w:pPr>
+      <w:proofErr w:type="spellStart"/>
+      <w:r>
+        <w:rPr>
+          <w:rFonts w:cs="Segoe UI"/>
+          <w:u w:val="single"/>
+        </w:rPr>
+        <w:t>פנינות</w:t>
+      </w:r>
+      <w:proofErr w:type="spellEnd"/>
+      <w:r>
+        <w:rPr>
+          <w:rFonts w:cs="Segoe UI"/>
+          <w:u w:val="single"/>
+        </w:rPr>
+        <w:t xml:space="preserve"> החוף השקטות</w:t>
+      </w:r>
+      <w:r>
+        <w:rPr>
+          <w:rFonts w:cs="Segoe UI" w:hint="cs"/>
+          <w:u w:val="single"/>
+        </w:rPr>
+        <w:t xml:space="preserve"> (0)</w:t>
+      </w:r>
+      <w:r>
+        <w:rPr>
+          <w:rFonts w:cs="Segoe UI"/>
+          <w:u w:val="single"/>
+        </w:rPr>
+        <w:t>:</w:t>
+      </w:r>
+      <w:r>
+        <w:rPr>
+          <w:rFonts w:cs="Segoe UI"/>
+        </w:rPr>
+        <w:t xml:space="preserve"> הקבוצה ה"חבויה" והמשתלמת מכולן. זוהי הקבוצה היחידה שמתבדלת גיאוגרפית (מחוץ למרכז), והיא משלבת את המחיר הנמוך ביותר, פער התמחור העמוק ביותר ושביעות הרצון המקסימלית במדגם – כל זאת לצד חשיפה (כמות ביקורות) אפסית כמעט.</w:t>
+      </w:r>
+    </w:p>
+    <w:p>
+      <w:pPr>
+        <w:spacing w:after="20"/>
+      </w:pPr>
+      <w:r>
+        <w:rPr>
+          <w:rFonts w:cs="Segoe UI" w:hint="cs"/>
+          <w:b/>
+          <w:color w:val="0072B2"/>
+        </w:rPr>
+        <w:t>הערכה חיצונית</w:t>
+      </w:r>
+      <w:r>
+        <w:rPr>
+          <w:rFonts w:cs="Segoe UI"/>
+          <w:b/>
+          <w:color w:val="0072B2"/>
+        </w:rPr>
+        <w:t>:</w:t>
       </w:r>
     </w:p>
     <w:tbl>
       <w:tblPr>
         <w:tblStyle w:val="4-1"/>
-        <w:tblW w:w="0" w:type="auto"/>
+        <w:tblpPr w:leftFromText="181" w:rightFromText="181" w:topFromText="57" w:bottomFromText="57" w:vertAnchor="text" w:horzAnchor="margin" w:tblpXSpec="center" w:tblpY="2441"/>
+        <w:tblW w:w="9763" w:type="dxa"/>
         <w:tblLook w:val="04A0" w:firstRow="1" w:lastRow="0" w:firstColumn="1" w:lastColumn="0" w:noHBand="0" w:noVBand="1"/>
       </w:tblPr>
       <w:tblGrid>
-        <w:gridCol w:w="926"/>
-        <w:gridCol w:w="897"/>
-        <w:gridCol w:w="843"/>
-        <w:gridCol w:w="766"/>
-        <w:gridCol w:w="775"/>
-        <w:gridCol w:w="821"/>
-        <w:gridCol w:w="939"/>
-        <w:gridCol w:w="644"/>
-        <w:gridCol w:w="854"/>
-        <w:gridCol w:w="527"/>
-        <w:gridCol w:w="1640"/>
-        <w:gridCol w:w="846"/>
+        <w:gridCol w:w="1977"/>
+        <w:gridCol w:w="1465"/>
+        <w:gridCol w:w="899"/>
+        <w:gridCol w:w="1560"/>
+        <w:gridCol w:w="959"/>
+        <w:gridCol w:w="1121"/>
+        <w:gridCol w:w="1782"/>
       </w:tblGrid>
       <w:tr>
         <w:trPr>
           <w:cnfStyle w:val="100000000000" w:firstRow="1" w:lastRow="0" w:firstColumn="0" w:lastColumn="0" w:oddVBand="0" w:evenVBand="0" w:oddHBand="0" w:evenHBand="0" w:firstRowFirstColumn="0" w:firstRowLastColumn="0" w:lastRowFirstColumn="0" w:lastRowLastColumn="0"/>
+          <w:trHeight w:val="523"/>
         </w:trPr>
         <w:tc>
           <w:tcPr>
@@ -5403,18 +5610,11 @@
           </w:tcPr>
           <w:p>
             <w:pPr>
-              <w:spacing w:after="120" w:line="276" w:lineRule="auto"/>
+              <w:spacing w:after="200" w:line="276" w:lineRule="auto"/>
               <w:jc w:val="center"/>
-              <w:rPr>
-                <w:rFonts w:cs="Segoe UI"/>
-                <w:rtl w:val="0"/>
-              </w:rPr>
             </w:pPr>
             <w:r>
-              <w:rPr>
-                <w:rFonts w:cs="Segoe UI"/>
-              </w:rPr>
-              <w:t>סוג נכס דומיננטי</w:t>
+              <w:t>משתנה חיצוני</w:t>
             </w:r>
           </w:p>
         </w:tc>
@@ -5426,18 +5626,12 @@
           </w:tcPr>
           <w:p>
             <w:pPr>
-              <w:spacing w:after="120" w:line="276" w:lineRule="auto"/>
+              <w:spacing w:after="200" w:line="276" w:lineRule="auto"/>
               <w:jc w:val="center"/>
               <w:cnfStyle w:val="100000000000" w:firstRow="1" w:lastRow="0" w:firstColumn="0" w:lastColumn="0" w:oddVBand="0" w:evenVBand="0" w:oddHBand="0" w:evenHBand="0" w:firstRowFirstColumn="0" w:firstRowLastColumn="0" w:lastRowFirstColumn="0" w:lastRowLastColumn="0"/>
-              <w:rPr>
-                <w:rFonts w:cs="Segoe UI"/>
-              </w:rPr>
             </w:pPr>
             <w:r>
-              <w:rPr>
-                <w:rFonts w:cs="Segoe UI"/>
-              </w:rPr>
-              <w:t>ביקורות</w:t>
+              <w:t>תפקיד</w:t>
             </w:r>
           </w:p>
         </w:tc>
@@ -5449,1489 +5643,8 @@
           </w:tcPr>
           <w:p>
             <w:pPr>
-              <w:spacing w:after="120" w:line="276" w:lineRule="auto"/>
+              <w:spacing w:after="200" w:line="276" w:lineRule="auto"/>
               <w:jc w:val="center"/>
-              <w:cnfStyle w:val="100000000000" w:firstRow="1" w:lastRow="0" w:firstColumn="0" w:lastColumn="0" w:oddVBand="0" w:evenVBand="0" w:oddHBand="0" w:evenHBand="0" w:firstRowFirstColumn="0" w:firstRowLastColumn="0" w:lastRowFirstColumn="0" w:lastRowLastColumn="0"/>
-              <w:rPr>
-                <w:rFonts w:cs="Segoe UI"/>
-              </w:rPr>
-            </w:pPr>
-            <w:r>
-              <w:rPr>
-                <w:rFonts w:cs="Segoe UI"/>
-              </w:rPr>
-              <w:t>חיוביות</w:t>
-            </w:r>
-          </w:p>
-        </w:tc>
-        <w:tc>
-          <w:tcPr>
-            <w:tcW w:w="0" w:type="auto"/>
-            <w:vAlign w:val="center"/>
-            <w:hideMark/>
-          </w:tcPr>
-          <w:p>
-            <w:pPr>
-              <w:spacing w:after="120" w:line="276" w:lineRule="auto"/>
-              <w:jc w:val="center"/>
-              <w:cnfStyle w:val="100000000000" w:firstRow="1" w:lastRow="0" w:firstColumn="0" w:lastColumn="0" w:oddVBand="0" w:evenVBand="0" w:oddHBand="0" w:evenHBand="0" w:firstRowFirstColumn="0" w:firstRowLastColumn="0" w:lastRowFirstColumn="0" w:lastRowLastColumn="0"/>
-              <w:rPr>
-                <w:rFonts w:cs="Segoe UI"/>
-              </w:rPr>
-            </w:pPr>
-            <w:r>
-              <w:rPr>
-                <w:rFonts w:cs="Segoe UI"/>
-              </w:rPr>
-              <w:t>הנחה</w:t>
-            </w:r>
-          </w:p>
-        </w:tc>
-        <w:tc>
-          <w:tcPr>
-            <w:tcW w:w="0" w:type="auto"/>
-            <w:vAlign w:val="center"/>
-            <w:hideMark/>
-          </w:tcPr>
-          <w:p>
-            <w:pPr>
-              <w:spacing w:after="120" w:line="276" w:lineRule="auto"/>
-              <w:jc w:val="center"/>
-              <w:cnfStyle w:val="100000000000" w:firstRow="1" w:lastRow="0" w:firstColumn="0" w:lastColumn="0" w:oddVBand="0" w:evenVBand="0" w:oddHBand="0" w:evenHBand="0" w:firstRowFirstColumn="0" w:firstRowLastColumn="0" w:lastRowFirstColumn="0" w:lastRowLastColumn="0"/>
-              <w:rPr>
-                <w:rFonts w:cs="Segoe UI"/>
-              </w:rPr>
-            </w:pPr>
-            <w:r>
-              <w:rPr>
-                <w:rFonts w:cs="Segoe UI"/>
-              </w:rPr>
-              <w:t>מחיר חזוי</w:t>
-            </w:r>
-          </w:p>
-        </w:tc>
-        <w:tc>
-          <w:tcPr>
-            <w:tcW w:w="0" w:type="auto"/>
-            <w:vAlign w:val="center"/>
-            <w:hideMark/>
-          </w:tcPr>
-          <w:p>
-            <w:pPr>
-              <w:spacing w:after="120" w:line="276" w:lineRule="auto"/>
-              <w:jc w:val="center"/>
-              <w:cnfStyle w:val="100000000000" w:firstRow="1" w:lastRow="0" w:firstColumn="0" w:lastColumn="0" w:oddVBand="0" w:evenVBand="0" w:oddHBand="0" w:evenHBand="0" w:firstRowFirstColumn="0" w:firstRowLastColumn="0" w:lastRowFirstColumn="0" w:lastRowLastColumn="0"/>
-              <w:rPr>
-                <w:rFonts w:cs="Segoe UI"/>
-              </w:rPr>
-            </w:pPr>
-            <w:r>
-              <w:rPr>
-                <w:rFonts w:cs="Segoe UI"/>
-              </w:rPr>
-              <w:t>מחיר ממוצע</w:t>
-            </w:r>
-          </w:p>
-        </w:tc>
-        <w:tc>
-          <w:tcPr>
-            <w:tcW w:w="0" w:type="auto"/>
-            <w:vAlign w:val="center"/>
-            <w:hideMark/>
-          </w:tcPr>
-          <w:p>
-            <w:pPr>
-              <w:spacing w:after="120" w:line="276" w:lineRule="auto"/>
-              <w:jc w:val="center"/>
-              <w:cnfStyle w:val="100000000000" w:firstRow="1" w:lastRow="0" w:firstColumn="0" w:lastColumn="0" w:oddVBand="0" w:evenVBand="0" w:oddHBand="0" w:evenHBand="0" w:firstRowFirstColumn="0" w:firstRowLastColumn="0" w:lastRowFirstColumn="0" w:lastRowLastColumn="0"/>
-              <w:rPr>
-                <w:rFonts w:cs="Segoe UI"/>
-              </w:rPr>
-            </w:pPr>
-            <w:r>
-              <w:rPr>
-                <w:rFonts w:cs="Segoe UI"/>
-              </w:rPr>
-              <w:t>שירותים</w:t>
-            </w:r>
-          </w:p>
-        </w:tc>
-        <w:tc>
-          <w:tcPr>
-            <w:tcW w:w="0" w:type="auto"/>
-            <w:vAlign w:val="center"/>
-            <w:hideMark/>
-          </w:tcPr>
-          <w:p>
-            <w:pPr>
-              <w:spacing w:after="120" w:line="276" w:lineRule="auto"/>
-              <w:jc w:val="center"/>
-              <w:cnfStyle w:val="100000000000" w:firstRow="1" w:lastRow="0" w:firstColumn="0" w:lastColumn="0" w:oddVBand="0" w:evenVBand="0" w:oddHBand="0" w:evenHBand="0" w:firstRowFirstColumn="0" w:firstRowLastColumn="0" w:lastRowFirstColumn="0" w:lastRowLastColumn="0"/>
-              <w:rPr>
-                <w:rFonts w:cs="Segoe UI"/>
-              </w:rPr>
-            </w:pPr>
-            <w:r>
-              <w:rPr>
-                <w:rFonts w:cs="Segoe UI"/>
-              </w:rPr>
-              <w:t>חדרי שינה</w:t>
-            </w:r>
-          </w:p>
-        </w:tc>
-        <w:tc>
-          <w:tcPr>
-            <w:tcW w:w="0" w:type="auto"/>
-            <w:vAlign w:val="center"/>
-            <w:hideMark/>
-          </w:tcPr>
-          <w:p>
-            <w:pPr>
-              <w:spacing w:after="120" w:line="276" w:lineRule="auto"/>
-              <w:jc w:val="center"/>
-              <w:cnfStyle w:val="100000000000" w:firstRow="1" w:lastRow="0" w:firstColumn="0" w:lastColumn="0" w:oddVBand="0" w:evenVBand="0" w:oddHBand="0" w:evenHBand="0" w:firstRowFirstColumn="0" w:firstRowLastColumn="0" w:lastRowFirstColumn="0" w:lastRowLastColumn="0"/>
-              <w:rPr>
-                <w:rFonts w:cs="Segoe UI"/>
-              </w:rPr>
-            </w:pPr>
-            <w:r>
-              <w:rPr>
-                <w:rFonts w:cs="Segoe UI"/>
-              </w:rPr>
-              <w:t>אורחים</w:t>
-            </w:r>
-          </w:p>
-        </w:tc>
-        <w:tc>
-          <w:tcPr>
-            <w:tcW w:w="0" w:type="auto"/>
-            <w:vAlign w:val="center"/>
-            <w:hideMark/>
-          </w:tcPr>
-          <w:p>
-            <w:pPr>
-              <w:spacing w:after="120" w:line="276" w:lineRule="auto"/>
-              <w:jc w:val="center"/>
-              <w:cnfStyle w:val="100000000000" w:firstRow="1" w:lastRow="0" w:firstColumn="0" w:lastColumn="0" w:oddVBand="0" w:evenVBand="0" w:oddHBand="0" w:evenHBand="0" w:firstRowFirstColumn="0" w:firstRowLastColumn="0" w:lastRowFirstColumn="0" w:lastRowLastColumn="0"/>
-              <w:rPr>
-                <w:rFonts w:cs="Segoe UI"/>
-              </w:rPr>
-            </w:pPr>
-            <w:r>
-              <w:rPr>
-                <w:rFonts w:cs="Segoe UI"/>
-              </w:rPr>
-              <w:t>n</w:t>
-            </w:r>
-          </w:p>
-        </w:tc>
-        <w:tc>
-          <w:tcPr>
-            <w:tcW w:w="0" w:type="auto"/>
-            <w:vAlign w:val="center"/>
-            <w:hideMark/>
-          </w:tcPr>
-          <w:p>
-            <w:pPr>
-              <w:spacing w:after="120" w:line="276" w:lineRule="auto"/>
-              <w:jc w:val="center"/>
-              <w:cnfStyle w:val="100000000000" w:firstRow="1" w:lastRow="0" w:firstColumn="0" w:lastColumn="0" w:oddVBand="0" w:evenVBand="0" w:oddHBand="0" w:evenHBand="0" w:firstRowFirstColumn="0" w:firstRowLastColumn="0" w:lastRowFirstColumn="0" w:lastRowLastColumn="0"/>
-              <w:rPr>
-                <w:rFonts w:cs="Segoe UI"/>
-              </w:rPr>
-            </w:pPr>
-            <w:r>
-              <w:rPr>
-                <w:rFonts w:cs="Segoe UI"/>
-              </w:rPr>
-              <w:t>שם</w:t>
-            </w:r>
-          </w:p>
-        </w:tc>
-        <w:tc>
-          <w:tcPr>
-            <w:tcW w:w="0" w:type="auto"/>
-            <w:vAlign w:val="center"/>
-            <w:hideMark/>
-          </w:tcPr>
-          <w:p>
-            <w:pPr>
-              <w:spacing w:after="120" w:line="276" w:lineRule="auto"/>
-              <w:jc w:val="center"/>
-              <w:cnfStyle w:val="100000000000" w:firstRow="1" w:lastRow="0" w:firstColumn="0" w:lastColumn="0" w:oddVBand="0" w:evenVBand="0" w:oddHBand="0" w:evenHBand="0" w:firstRowFirstColumn="0" w:firstRowLastColumn="0" w:lastRowFirstColumn="0" w:lastRowLastColumn="0"/>
-              <w:rPr>
-                <w:rFonts w:cs="Segoe UI"/>
-              </w:rPr>
-            </w:pPr>
-            <w:proofErr w:type="spellStart"/>
-            <w:r>
-              <w:rPr>
-                <w:rFonts w:cs="Segoe UI"/>
-              </w:rPr>
-              <w:t>Cluster</w:t>
-            </w:r>
-            <w:proofErr w:type="spellEnd"/>
-          </w:p>
-        </w:tc>
-      </w:tr>
-      <w:tr>
-        <w:trPr>
-          <w:cnfStyle w:val="000000100000" w:firstRow="0" w:lastRow="0" w:firstColumn="0" w:lastColumn="0" w:oddVBand="0" w:evenVBand="0" w:oddHBand="1" w:evenHBand="0" w:firstRowFirstColumn="0" w:firstRowLastColumn="0" w:lastRowFirstColumn="0" w:lastRowLastColumn="0"/>
-        </w:trPr>
-        <w:tc>
-          <w:tcPr>
-            <w:cnfStyle w:val="001000000000" w:firstRow="0" w:lastRow="0" w:firstColumn="1" w:lastColumn="0" w:oddVBand="0" w:evenVBand="0" w:oddHBand="0" w:evenHBand="0" w:firstRowFirstColumn="0" w:firstRowLastColumn="0" w:lastRowFirstColumn="0" w:lastRowLastColumn="0"/>
-            <w:tcW w:w="0" w:type="auto"/>
-            <w:vAlign w:val="center"/>
-            <w:hideMark/>
-          </w:tcPr>
-          <w:p>
-            <w:pPr>
-              <w:spacing w:after="120" w:line="276" w:lineRule="auto"/>
-              <w:jc w:val="center"/>
-              <w:rPr>
-                <w:rFonts w:cs="Segoe UI"/>
-              </w:rPr>
-            </w:pPr>
-            <w:r>
-              <w:rPr>
-                <w:rFonts w:cs="Segoe UI"/>
-              </w:rPr>
-              <w:t>59.8% דירה שלמה, 39.1% חדר פרטי</w:t>
-            </w:r>
-          </w:p>
-        </w:tc>
-        <w:tc>
-          <w:tcPr>
-            <w:tcW w:w="0" w:type="auto"/>
-            <w:vAlign w:val="center"/>
-            <w:hideMark/>
-          </w:tcPr>
-          <w:p>
-            <w:pPr>
-              <w:spacing w:after="120" w:line="276" w:lineRule="auto"/>
-              <w:jc w:val="center"/>
-              <w:cnfStyle w:val="000000100000" w:firstRow="0" w:lastRow="0" w:firstColumn="0" w:lastColumn="0" w:oddVBand="0" w:evenVBand="0" w:oddHBand="1" w:evenHBand="0" w:firstRowFirstColumn="0" w:firstRowLastColumn="0" w:lastRowFirstColumn="0" w:lastRowLastColumn="0"/>
-              <w:rPr>
-                <w:rFonts w:cs="Segoe UI"/>
-              </w:rPr>
-            </w:pPr>
-            <w:r>
-              <w:rPr>
-                <w:rFonts w:cs="Segoe UI"/>
-              </w:rPr>
-              <w:t>38.1</w:t>
-            </w:r>
-          </w:p>
-        </w:tc>
-        <w:tc>
-          <w:tcPr>
-            <w:tcW w:w="0" w:type="auto"/>
-            <w:vAlign w:val="center"/>
-            <w:hideMark/>
-          </w:tcPr>
-          <w:p>
-            <w:pPr>
-              <w:spacing w:after="120" w:line="276" w:lineRule="auto"/>
-              <w:jc w:val="center"/>
-              <w:cnfStyle w:val="000000100000" w:firstRow="0" w:lastRow="0" w:firstColumn="0" w:lastColumn="0" w:oddVBand="0" w:evenVBand="0" w:oddHBand="1" w:evenHBand="0" w:firstRowFirstColumn="0" w:firstRowLastColumn="0" w:lastRowFirstColumn="0" w:lastRowLastColumn="0"/>
-              <w:rPr>
-                <w:rFonts w:cs="Segoe UI"/>
-              </w:rPr>
-            </w:pPr>
-            <w:r>
-              <w:rPr>
-                <w:rFonts w:cs="Segoe UI"/>
-              </w:rPr>
-              <w:t>95.4%</w:t>
-            </w:r>
-          </w:p>
-        </w:tc>
-        <w:tc>
-          <w:tcPr>
-            <w:tcW w:w="0" w:type="auto"/>
-            <w:vAlign w:val="center"/>
-            <w:hideMark/>
-          </w:tcPr>
-          <w:p>
-            <w:pPr>
-              <w:spacing w:after="120" w:line="276" w:lineRule="auto"/>
-              <w:jc w:val="center"/>
-              <w:cnfStyle w:val="000000100000" w:firstRow="0" w:lastRow="0" w:firstColumn="0" w:lastColumn="0" w:oddVBand="0" w:evenVBand="0" w:oddHBand="1" w:evenHBand="0" w:firstRowFirstColumn="0" w:firstRowLastColumn="0" w:lastRowFirstColumn="0" w:lastRowLastColumn="0"/>
-              <w:rPr>
-                <w:rFonts w:cs="Segoe UI"/>
-              </w:rPr>
-            </w:pPr>
-            <w:r>
-              <w:rPr>
-                <w:rFonts w:cs="Segoe UI"/>
-              </w:rPr>
-              <w:t>32.4%</w:t>
-            </w:r>
-          </w:p>
-        </w:tc>
-        <w:tc>
-          <w:tcPr>
-            <w:tcW w:w="0" w:type="auto"/>
-            <w:vAlign w:val="center"/>
-            <w:hideMark/>
-          </w:tcPr>
-          <w:p>
-            <w:pPr>
-              <w:spacing w:after="120" w:line="276" w:lineRule="auto"/>
-              <w:jc w:val="center"/>
-              <w:cnfStyle w:val="000000100000" w:firstRow="0" w:lastRow="0" w:firstColumn="0" w:lastColumn="0" w:oddVBand="0" w:evenVBand="0" w:oddHBand="1" w:evenHBand="0" w:firstRowFirstColumn="0" w:firstRowLastColumn="0" w:lastRowFirstColumn="0" w:lastRowLastColumn="0"/>
-              <w:rPr>
-                <w:rFonts w:cs="Segoe UI"/>
-              </w:rPr>
-            </w:pPr>
-            <w:r>
-              <w:rPr>
-                <w:rFonts w:cs="Segoe UI"/>
-              </w:rPr>
-              <w:t>€141.3</w:t>
-            </w:r>
-          </w:p>
-        </w:tc>
-        <w:tc>
-          <w:tcPr>
-            <w:tcW w:w="0" w:type="auto"/>
-            <w:vAlign w:val="center"/>
-            <w:hideMark/>
-          </w:tcPr>
-          <w:p>
-            <w:pPr>
-              <w:spacing w:after="120" w:line="276" w:lineRule="auto"/>
-              <w:jc w:val="center"/>
-              <w:cnfStyle w:val="000000100000" w:firstRow="0" w:lastRow="0" w:firstColumn="0" w:lastColumn="0" w:oddVBand="0" w:evenVBand="0" w:oddHBand="1" w:evenHBand="0" w:firstRowFirstColumn="0" w:firstRowLastColumn="0" w:lastRowFirstColumn="0" w:lastRowLastColumn="0"/>
-              <w:rPr>
-                <w:rFonts w:cs="Segoe UI"/>
-              </w:rPr>
-            </w:pPr>
-            <w:r>
-              <w:rPr>
-                <w:rFonts w:cs="Segoe UI"/>
-              </w:rPr>
-              <w:t>€96.3</w:t>
-            </w:r>
-          </w:p>
-        </w:tc>
-        <w:tc>
-          <w:tcPr>
-            <w:tcW w:w="0" w:type="auto"/>
-            <w:vAlign w:val="center"/>
-            <w:hideMark/>
-          </w:tcPr>
-          <w:p>
-            <w:pPr>
-              <w:spacing w:after="120" w:line="276" w:lineRule="auto"/>
-              <w:jc w:val="center"/>
-              <w:cnfStyle w:val="000000100000" w:firstRow="0" w:lastRow="0" w:firstColumn="0" w:lastColumn="0" w:oddVBand="0" w:evenVBand="0" w:oddHBand="1" w:evenHBand="0" w:firstRowFirstColumn="0" w:firstRowLastColumn="0" w:lastRowFirstColumn="0" w:lastRowLastColumn="0"/>
-              <w:rPr>
-                <w:rFonts w:cs="Segoe UI"/>
-              </w:rPr>
-            </w:pPr>
-            <w:r>
-              <w:rPr>
-                <w:rFonts w:cs="Segoe UI"/>
-                <w:b/>
-                <w:bCs/>
-              </w:rPr>
-              <w:t>22.1</w:t>
-            </w:r>
-          </w:p>
-        </w:tc>
-        <w:tc>
-          <w:tcPr>
-            <w:tcW w:w="0" w:type="auto"/>
-            <w:vAlign w:val="center"/>
-            <w:hideMark/>
-          </w:tcPr>
-          <w:p>
-            <w:pPr>
-              <w:spacing w:after="120" w:line="276" w:lineRule="auto"/>
-              <w:jc w:val="center"/>
-              <w:cnfStyle w:val="000000100000" w:firstRow="0" w:lastRow="0" w:firstColumn="0" w:lastColumn="0" w:oddVBand="0" w:evenVBand="0" w:oddHBand="1" w:evenHBand="0" w:firstRowFirstColumn="0" w:firstRowLastColumn="0" w:lastRowFirstColumn="0" w:lastRowLastColumn="0"/>
-              <w:rPr>
-                <w:rFonts w:cs="Segoe UI"/>
-              </w:rPr>
-            </w:pPr>
-            <w:r>
-              <w:rPr>
-                <w:rFonts w:cs="Segoe UI"/>
-              </w:rPr>
-              <w:t>1.15</w:t>
-            </w:r>
-          </w:p>
-        </w:tc>
-        <w:tc>
-          <w:tcPr>
-            <w:tcW w:w="0" w:type="auto"/>
-            <w:vAlign w:val="center"/>
-            <w:hideMark/>
-          </w:tcPr>
-          <w:p>
-            <w:pPr>
-              <w:spacing w:after="120" w:line="276" w:lineRule="auto"/>
-              <w:jc w:val="center"/>
-              <w:cnfStyle w:val="000000100000" w:firstRow="0" w:lastRow="0" w:firstColumn="0" w:lastColumn="0" w:oddVBand="0" w:evenVBand="0" w:oddHBand="1" w:evenHBand="0" w:firstRowFirstColumn="0" w:firstRowLastColumn="0" w:lastRowFirstColumn="0" w:lastRowLastColumn="0"/>
-              <w:rPr>
-                <w:rFonts w:cs="Segoe UI"/>
-              </w:rPr>
-            </w:pPr>
-            <w:r>
-              <w:rPr>
-                <w:rFonts w:cs="Segoe UI"/>
-              </w:rPr>
-              <w:t>2.95</w:t>
-            </w:r>
-          </w:p>
-        </w:tc>
-        <w:tc>
-          <w:tcPr>
-            <w:tcW w:w="0" w:type="auto"/>
-            <w:vAlign w:val="center"/>
-            <w:hideMark/>
-          </w:tcPr>
-          <w:p>
-            <w:pPr>
-              <w:spacing w:after="120" w:line="276" w:lineRule="auto"/>
-              <w:jc w:val="center"/>
-              <w:cnfStyle w:val="000000100000" w:firstRow="0" w:lastRow="0" w:firstColumn="0" w:lastColumn="0" w:oddVBand="0" w:evenVBand="0" w:oddHBand="1" w:evenHBand="0" w:firstRowFirstColumn="0" w:firstRowLastColumn="0" w:lastRowFirstColumn="0" w:lastRowLastColumn="0"/>
-              <w:rPr>
-                <w:rFonts w:cs="Segoe UI"/>
-              </w:rPr>
-            </w:pPr>
-            <w:r>
-              <w:rPr>
-                <w:rFonts w:cs="Segoe UI"/>
-              </w:rPr>
-              <w:t>184</w:t>
-            </w:r>
-          </w:p>
-        </w:tc>
-        <w:tc>
-          <w:tcPr>
-            <w:tcW w:w="0" w:type="auto"/>
-            <w:vAlign w:val="center"/>
-            <w:hideMark/>
-          </w:tcPr>
-          <w:p>
-            <w:pPr>
-              <w:spacing w:after="120" w:line="276" w:lineRule="auto"/>
-              <w:jc w:val="center"/>
-              <w:cnfStyle w:val="000000100000" w:firstRow="0" w:lastRow="0" w:firstColumn="0" w:lastColumn="0" w:oddVBand="0" w:evenVBand="0" w:oddHBand="1" w:evenHBand="0" w:firstRowFirstColumn="0" w:firstRowLastColumn="0" w:lastRowFirstColumn="0" w:lastRowLastColumn="0"/>
-              <w:rPr>
-                <w:rFonts w:cs="Segoe UI"/>
-              </w:rPr>
-            </w:pPr>
-            <w:r>
-              <w:rPr>
-                <w:rFonts w:cs="Segoe UI"/>
-              </w:rPr>
-              <w:t>דירות מרכזיות קומפקטיות ובסיסיות</w:t>
-            </w:r>
-          </w:p>
-        </w:tc>
-        <w:tc>
-          <w:tcPr>
-            <w:tcW w:w="0" w:type="auto"/>
-            <w:vAlign w:val="center"/>
-            <w:hideMark/>
-          </w:tcPr>
-          <w:p>
-            <w:pPr>
-              <w:spacing w:after="120" w:line="276" w:lineRule="auto"/>
-              <w:jc w:val="center"/>
-              <w:cnfStyle w:val="000000100000" w:firstRow="0" w:lastRow="0" w:firstColumn="0" w:lastColumn="0" w:oddVBand="0" w:evenVBand="0" w:oddHBand="1" w:evenHBand="0" w:firstRowFirstColumn="0" w:firstRowLastColumn="0" w:lastRowFirstColumn="0" w:lastRowLastColumn="0"/>
-              <w:rPr>
-                <w:rFonts w:cs="Segoe UI"/>
-              </w:rPr>
-            </w:pPr>
-            <w:r>
-              <w:rPr>
-                <w:rFonts w:cs="Segoe UI"/>
-              </w:rPr>
-              <w:t>3</w:t>
-            </w:r>
-          </w:p>
-        </w:tc>
-      </w:tr>
-      <w:tr>
-        <w:tc>
-          <w:tcPr>
-            <w:cnfStyle w:val="001000000000" w:firstRow="0" w:lastRow="0" w:firstColumn="1" w:lastColumn="0" w:oddVBand="0" w:evenVBand="0" w:oddHBand="0" w:evenHBand="0" w:firstRowFirstColumn="0" w:firstRowLastColumn="0" w:lastRowFirstColumn="0" w:lastRowLastColumn="0"/>
-            <w:tcW w:w="0" w:type="auto"/>
-            <w:vAlign w:val="center"/>
-            <w:hideMark/>
-          </w:tcPr>
-          <w:p>
-            <w:pPr>
-              <w:spacing w:after="120" w:line="276" w:lineRule="auto"/>
-              <w:jc w:val="center"/>
-              <w:rPr>
-                <w:rFonts w:cs="Segoe UI"/>
-              </w:rPr>
-            </w:pPr>
-            <w:r>
-              <w:rPr>
-                <w:rFonts w:cs="Segoe UI"/>
-              </w:rPr>
-              <w:t>87.2% דירה שלמה</w:t>
-            </w:r>
-          </w:p>
-        </w:tc>
-        <w:tc>
-          <w:tcPr>
-            <w:tcW w:w="0" w:type="auto"/>
-            <w:vAlign w:val="center"/>
-            <w:hideMark/>
-          </w:tcPr>
-          <w:p>
-            <w:pPr>
-              <w:spacing w:after="120" w:line="276" w:lineRule="auto"/>
-              <w:jc w:val="center"/>
-              <w:cnfStyle w:val="000000000000" w:firstRow="0" w:lastRow="0" w:firstColumn="0" w:lastColumn="0" w:oddVBand="0" w:evenVBand="0" w:oddHBand="0" w:evenHBand="0" w:firstRowFirstColumn="0" w:firstRowLastColumn="0" w:lastRowFirstColumn="0" w:lastRowLastColumn="0"/>
-              <w:rPr>
-                <w:rFonts w:cs="Segoe UI"/>
-              </w:rPr>
-            </w:pPr>
-            <w:r>
-              <w:rPr>
-                <w:rFonts w:cs="Segoe UI"/>
-              </w:rPr>
-              <w:t>50.2</w:t>
-            </w:r>
-          </w:p>
-        </w:tc>
-        <w:tc>
-          <w:tcPr>
-            <w:tcW w:w="0" w:type="auto"/>
-            <w:vAlign w:val="center"/>
-            <w:hideMark/>
-          </w:tcPr>
-          <w:p>
-            <w:pPr>
-              <w:spacing w:after="120" w:line="276" w:lineRule="auto"/>
-              <w:jc w:val="center"/>
-              <w:cnfStyle w:val="000000000000" w:firstRow="0" w:lastRow="0" w:firstColumn="0" w:lastColumn="0" w:oddVBand="0" w:evenVBand="0" w:oddHBand="0" w:evenHBand="0" w:firstRowFirstColumn="0" w:firstRowLastColumn="0" w:lastRowFirstColumn="0" w:lastRowLastColumn="0"/>
-              <w:rPr>
-                <w:rFonts w:cs="Segoe UI"/>
-              </w:rPr>
-            </w:pPr>
-            <w:r>
-              <w:rPr>
-                <w:rFonts w:cs="Segoe UI"/>
-              </w:rPr>
-              <w:t>93.3%</w:t>
-            </w:r>
-          </w:p>
-        </w:tc>
-        <w:tc>
-          <w:tcPr>
-            <w:tcW w:w="0" w:type="auto"/>
-            <w:vAlign w:val="center"/>
-            <w:hideMark/>
-          </w:tcPr>
-          <w:p>
-            <w:pPr>
-              <w:spacing w:after="120" w:line="276" w:lineRule="auto"/>
-              <w:jc w:val="center"/>
-              <w:cnfStyle w:val="000000000000" w:firstRow="0" w:lastRow="0" w:firstColumn="0" w:lastColumn="0" w:oddVBand="0" w:evenVBand="0" w:oddHBand="0" w:evenHBand="0" w:firstRowFirstColumn="0" w:firstRowLastColumn="0" w:lastRowFirstColumn="0" w:lastRowLastColumn="0"/>
-              <w:rPr>
-                <w:rFonts w:cs="Segoe UI"/>
-              </w:rPr>
-            </w:pPr>
-            <w:r>
-              <w:rPr>
-                <w:rFonts w:cs="Segoe UI"/>
-              </w:rPr>
-              <w:t>31.8%</w:t>
-            </w:r>
-          </w:p>
-        </w:tc>
-        <w:tc>
-          <w:tcPr>
-            <w:tcW w:w="0" w:type="auto"/>
-            <w:vAlign w:val="center"/>
-            <w:hideMark/>
-          </w:tcPr>
-          <w:p>
-            <w:pPr>
-              <w:spacing w:after="120" w:line="276" w:lineRule="auto"/>
-              <w:jc w:val="center"/>
-              <w:cnfStyle w:val="000000000000" w:firstRow="0" w:lastRow="0" w:firstColumn="0" w:lastColumn="0" w:oddVBand="0" w:evenVBand="0" w:oddHBand="0" w:evenHBand="0" w:firstRowFirstColumn="0" w:firstRowLastColumn="0" w:lastRowFirstColumn="0" w:lastRowLastColumn="0"/>
-              <w:rPr>
-                <w:rFonts w:cs="Segoe UI"/>
-              </w:rPr>
-            </w:pPr>
-            <w:r>
-              <w:rPr>
-                <w:rFonts w:cs="Segoe UI"/>
-              </w:rPr>
-              <w:t>€188.0</w:t>
-            </w:r>
-          </w:p>
-        </w:tc>
-        <w:tc>
-          <w:tcPr>
-            <w:tcW w:w="0" w:type="auto"/>
-            <w:vAlign w:val="center"/>
-            <w:hideMark/>
-          </w:tcPr>
-          <w:p>
-            <w:pPr>
-              <w:spacing w:after="120" w:line="276" w:lineRule="auto"/>
-              <w:jc w:val="center"/>
-              <w:cnfStyle w:val="000000000000" w:firstRow="0" w:lastRow="0" w:firstColumn="0" w:lastColumn="0" w:oddVBand="0" w:evenVBand="0" w:oddHBand="0" w:evenHBand="0" w:firstRowFirstColumn="0" w:firstRowLastColumn="0" w:lastRowFirstColumn="0" w:lastRowLastColumn="0"/>
-              <w:rPr>
-                <w:rFonts w:cs="Segoe UI"/>
-              </w:rPr>
-            </w:pPr>
-            <w:r>
-              <w:rPr>
-                <w:rFonts w:cs="Segoe UI"/>
-              </w:rPr>
-              <w:t>€128.2</w:t>
-            </w:r>
-          </w:p>
-        </w:tc>
-        <w:tc>
-          <w:tcPr>
-            <w:tcW w:w="0" w:type="auto"/>
-            <w:vAlign w:val="center"/>
-            <w:hideMark/>
-          </w:tcPr>
-          <w:p>
-            <w:pPr>
-              <w:spacing w:after="120" w:line="276" w:lineRule="auto"/>
-              <w:jc w:val="center"/>
-              <w:cnfStyle w:val="000000000000" w:firstRow="0" w:lastRow="0" w:firstColumn="0" w:lastColumn="0" w:oddVBand="0" w:evenVBand="0" w:oddHBand="0" w:evenHBand="0" w:firstRowFirstColumn="0" w:firstRowLastColumn="0" w:lastRowFirstColumn="0" w:lastRowLastColumn="0"/>
-              <w:rPr>
-                <w:rFonts w:cs="Segoe UI"/>
-              </w:rPr>
-            </w:pPr>
-            <w:r>
-              <w:rPr>
-                <w:rFonts w:cs="Segoe UI"/>
-                <w:b/>
-                <w:bCs/>
-              </w:rPr>
-              <w:t>44.2</w:t>
-            </w:r>
-          </w:p>
-        </w:tc>
-        <w:tc>
-          <w:tcPr>
-            <w:tcW w:w="0" w:type="auto"/>
-            <w:vAlign w:val="center"/>
-            <w:hideMark/>
-          </w:tcPr>
-          <w:p>
-            <w:pPr>
-              <w:spacing w:after="120" w:line="276" w:lineRule="auto"/>
-              <w:jc w:val="center"/>
-              <w:cnfStyle w:val="000000000000" w:firstRow="0" w:lastRow="0" w:firstColumn="0" w:lastColumn="0" w:oddVBand="0" w:evenVBand="0" w:oddHBand="0" w:evenHBand="0" w:firstRowFirstColumn="0" w:firstRowLastColumn="0" w:lastRowFirstColumn="0" w:lastRowLastColumn="0"/>
-              <w:rPr>
-                <w:rFonts w:cs="Segoe UI"/>
-              </w:rPr>
-            </w:pPr>
-            <w:r>
-              <w:rPr>
-                <w:rFonts w:cs="Segoe UI"/>
-              </w:rPr>
-              <w:t>1.52</w:t>
-            </w:r>
-          </w:p>
-        </w:tc>
-        <w:tc>
-          <w:tcPr>
-            <w:tcW w:w="0" w:type="auto"/>
-            <w:vAlign w:val="center"/>
-            <w:hideMark/>
-          </w:tcPr>
-          <w:p>
-            <w:pPr>
-              <w:spacing w:after="120" w:line="276" w:lineRule="auto"/>
-              <w:jc w:val="center"/>
-              <w:cnfStyle w:val="000000000000" w:firstRow="0" w:lastRow="0" w:firstColumn="0" w:lastColumn="0" w:oddVBand="0" w:evenVBand="0" w:oddHBand="0" w:evenHBand="0" w:firstRowFirstColumn="0" w:firstRowLastColumn="0" w:lastRowFirstColumn="0" w:lastRowLastColumn="0"/>
-              <w:rPr>
-                <w:rFonts w:cs="Segoe UI"/>
-              </w:rPr>
-            </w:pPr>
-            <w:r>
-              <w:rPr>
-                <w:rFonts w:cs="Segoe UI"/>
-              </w:rPr>
-              <w:t>4.04</w:t>
-            </w:r>
-          </w:p>
-        </w:tc>
-        <w:tc>
-          <w:tcPr>
-            <w:tcW w:w="0" w:type="auto"/>
-            <w:vAlign w:val="center"/>
-            <w:hideMark/>
-          </w:tcPr>
-          <w:p>
-            <w:pPr>
-              <w:spacing w:after="120" w:line="276" w:lineRule="auto"/>
-              <w:jc w:val="center"/>
-              <w:cnfStyle w:val="000000000000" w:firstRow="0" w:lastRow="0" w:firstColumn="0" w:lastColumn="0" w:oddVBand="0" w:evenVBand="0" w:oddHBand="0" w:evenHBand="0" w:firstRowFirstColumn="0" w:firstRowLastColumn="0" w:lastRowFirstColumn="0" w:lastRowLastColumn="0"/>
-              <w:rPr>
-                <w:rFonts w:cs="Segoe UI"/>
-              </w:rPr>
-            </w:pPr>
-            <w:r>
-              <w:rPr>
-                <w:rFonts w:cs="Segoe UI"/>
-              </w:rPr>
-              <w:t>203</w:t>
-            </w:r>
-          </w:p>
-        </w:tc>
-        <w:tc>
-          <w:tcPr>
-            <w:tcW w:w="0" w:type="auto"/>
-            <w:vAlign w:val="center"/>
-            <w:hideMark/>
-          </w:tcPr>
-          <w:p>
-            <w:pPr>
-              <w:spacing w:after="120" w:line="276" w:lineRule="auto"/>
-              <w:jc w:val="center"/>
-              <w:cnfStyle w:val="000000000000" w:firstRow="0" w:lastRow="0" w:firstColumn="0" w:lastColumn="0" w:oddVBand="0" w:evenVBand="0" w:oddHBand="0" w:evenHBand="0" w:firstRowFirstColumn="0" w:firstRowLastColumn="0" w:lastRowFirstColumn="0" w:lastRowLastColumn="0"/>
-              <w:rPr>
-                <w:rFonts w:cs="Segoe UI"/>
-              </w:rPr>
-            </w:pPr>
-            <w:r>
-              <w:rPr>
-                <w:rFonts w:cs="Segoe UI"/>
-              </w:rPr>
-              <w:t>דירות מרכזיות מאובזרות היטב</w:t>
-            </w:r>
-          </w:p>
-        </w:tc>
-        <w:tc>
-          <w:tcPr>
-            <w:tcW w:w="0" w:type="auto"/>
-            <w:vAlign w:val="center"/>
-            <w:hideMark/>
-          </w:tcPr>
-          <w:p>
-            <w:pPr>
-              <w:spacing w:after="120" w:line="276" w:lineRule="auto"/>
-              <w:jc w:val="center"/>
-              <w:cnfStyle w:val="000000000000" w:firstRow="0" w:lastRow="0" w:firstColumn="0" w:lastColumn="0" w:oddVBand="0" w:evenVBand="0" w:oddHBand="0" w:evenHBand="0" w:firstRowFirstColumn="0" w:firstRowLastColumn="0" w:lastRowFirstColumn="0" w:lastRowLastColumn="0"/>
-              <w:rPr>
-                <w:rFonts w:cs="Segoe UI"/>
-              </w:rPr>
-            </w:pPr>
-            <w:r>
-              <w:rPr>
-                <w:rFonts w:cs="Segoe UI"/>
-              </w:rPr>
-              <w:t>1</w:t>
-            </w:r>
-          </w:p>
-        </w:tc>
-      </w:tr>
-      <w:tr>
-        <w:trPr>
-          <w:cnfStyle w:val="000000100000" w:firstRow="0" w:lastRow="0" w:firstColumn="0" w:lastColumn="0" w:oddVBand="0" w:evenVBand="0" w:oddHBand="1" w:evenHBand="0" w:firstRowFirstColumn="0" w:firstRowLastColumn="0" w:lastRowFirstColumn="0" w:lastRowLastColumn="0"/>
-        </w:trPr>
-        <w:tc>
-          <w:tcPr>
-            <w:cnfStyle w:val="001000000000" w:firstRow="0" w:lastRow="0" w:firstColumn="1" w:lastColumn="0" w:oddVBand="0" w:evenVBand="0" w:oddHBand="0" w:evenHBand="0" w:firstRowFirstColumn="0" w:firstRowLastColumn="0" w:lastRowFirstColumn="0" w:lastRowLastColumn="0"/>
-            <w:tcW w:w="0" w:type="auto"/>
-            <w:vAlign w:val="center"/>
-            <w:hideMark/>
-          </w:tcPr>
-          <w:p>
-            <w:pPr>
-              <w:spacing w:after="120" w:line="276" w:lineRule="auto"/>
-              <w:jc w:val="center"/>
-              <w:rPr>
-                <w:rFonts w:cs="Segoe UI"/>
-              </w:rPr>
-            </w:pPr>
-            <w:r>
-              <w:rPr>
-                <w:rFonts w:cs="Segoe UI"/>
-              </w:rPr>
-              <w:t>100% דירה שלמה</w:t>
-            </w:r>
-          </w:p>
-        </w:tc>
-        <w:tc>
-          <w:tcPr>
-            <w:tcW w:w="0" w:type="auto"/>
-            <w:vAlign w:val="center"/>
-            <w:hideMark/>
-          </w:tcPr>
-          <w:p>
-            <w:pPr>
-              <w:spacing w:after="120" w:line="276" w:lineRule="auto"/>
-              <w:jc w:val="center"/>
-              <w:cnfStyle w:val="000000100000" w:firstRow="0" w:lastRow="0" w:firstColumn="0" w:lastColumn="0" w:oddVBand="0" w:evenVBand="0" w:oddHBand="1" w:evenHBand="0" w:firstRowFirstColumn="0" w:firstRowLastColumn="0" w:lastRowFirstColumn="0" w:lastRowLastColumn="0"/>
-              <w:rPr>
-                <w:rFonts w:cs="Segoe UI"/>
-              </w:rPr>
-            </w:pPr>
-            <w:r>
-              <w:rPr>
-                <w:rFonts w:cs="Segoe UI"/>
-              </w:rPr>
-              <w:t>56.0</w:t>
-            </w:r>
-          </w:p>
-        </w:tc>
-        <w:tc>
-          <w:tcPr>
-            <w:tcW w:w="0" w:type="auto"/>
-            <w:vAlign w:val="center"/>
-            <w:hideMark/>
-          </w:tcPr>
-          <w:p>
-            <w:pPr>
-              <w:spacing w:after="120" w:line="276" w:lineRule="auto"/>
-              <w:jc w:val="center"/>
-              <w:cnfStyle w:val="000000100000" w:firstRow="0" w:lastRow="0" w:firstColumn="0" w:lastColumn="0" w:oddVBand="0" w:evenVBand="0" w:oddHBand="1" w:evenHBand="0" w:firstRowFirstColumn="0" w:firstRowLastColumn="0" w:lastRowFirstColumn="0" w:lastRowLastColumn="0"/>
-              <w:rPr>
-                <w:rFonts w:cs="Segoe UI"/>
-              </w:rPr>
-            </w:pPr>
-            <w:r>
-              <w:rPr>
-                <w:rFonts w:cs="Segoe UI"/>
-              </w:rPr>
-              <w:t>93.9%</w:t>
-            </w:r>
-          </w:p>
-        </w:tc>
-        <w:tc>
-          <w:tcPr>
-            <w:tcW w:w="0" w:type="auto"/>
-            <w:vAlign w:val="center"/>
-            <w:hideMark/>
-          </w:tcPr>
-          <w:p>
-            <w:pPr>
-              <w:spacing w:after="120" w:line="276" w:lineRule="auto"/>
-              <w:jc w:val="center"/>
-              <w:cnfStyle w:val="000000100000" w:firstRow="0" w:lastRow="0" w:firstColumn="0" w:lastColumn="0" w:oddVBand="0" w:evenVBand="0" w:oddHBand="1" w:evenHBand="0" w:firstRowFirstColumn="0" w:firstRowLastColumn="0" w:lastRowFirstColumn="0" w:lastRowLastColumn="0"/>
-              <w:rPr>
-                <w:rFonts w:cs="Segoe UI"/>
-              </w:rPr>
-            </w:pPr>
-            <w:r>
-              <w:rPr>
-                <w:rFonts w:cs="Segoe UI"/>
-              </w:rPr>
-              <w:t>35.8%</w:t>
-            </w:r>
-          </w:p>
-        </w:tc>
-        <w:tc>
-          <w:tcPr>
-            <w:tcW w:w="0" w:type="auto"/>
-            <w:vAlign w:val="center"/>
-            <w:hideMark/>
-          </w:tcPr>
-          <w:p>
-            <w:pPr>
-              <w:spacing w:after="120" w:line="276" w:lineRule="auto"/>
-              <w:jc w:val="center"/>
-              <w:cnfStyle w:val="000000100000" w:firstRow="0" w:lastRow="0" w:firstColumn="0" w:lastColumn="0" w:oddVBand="0" w:evenVBand="0" w:oddHBand="1" w:evenHBand="0" w:firstRowFirstColumn="0" w:firstRowLastColumn="0" w:lastRowFirstColumn="0" w:lastRowLastColumn="0"/>
-              <w:rPr>
-                <w:rFonts w:cs="Segoe UI"/>
-              </w:rPr>
-            </w:pPr>
-            <w:r>
-              <w:rPr>
-                <w:rFonts w:cs="Segoe UI"/>
-              </w:rPr>
-              <w:t>€415.4</w:t>
-            </w:r>
-          </w:p>
-        </w:tc>
-        <w:tc>
-          <w:tcPr>
-            <w:tcW w:w="0" w:type="auto"/>
-            <w:vAlign w:val="center"/>
-            <w:hideMark/>
-          </w:tcPr>
-          <w:p>
-            <w:pPr>
-              <w:spacing w:after="120" w:line="276" w:lineRule="auto"/>
-              <w:jc w:val="center"/>
-              <w:cnfStyle w:val="000000100000" w:firstRow="0" w:lastRow="0" w:firstColumn="0" w:lastColumn="0" w:oddVBand="0" w:evenVBand="0" w:oddHBand="1" w:evenHBand="0" w:firstRowFirstColumn="0" w:firstRowLastColumn="0" w:lastRowFirstColumn="0" w:lastRowLastColumn="0"/>
-              <w:rPr>
-                <w:rFonts w:cs="Segoe UI"/>
-              </w:rPr>
-            </w:pPr>
-            <w:r>
-              <w:rPr>
-                <w:rFonts w:cs="Segoe UI"/>
-                <w:b/>
-                <w:bCs/>
-              </w:rPr>
-              <w:t>€256.7</w:t>
-            </w:r>
-          </w:p>
-        </w:tc>
-        <w:tc>
-          <w:tcPr>
-            <w:tcW w:w="0" w:type="auto"/>
-            <w:vAlign w:val="center"/>
-            <w:hideMark/>
-          </w:tcPr>
-          <w:p>
-            <w:pPr>
-              <w:spacing w:after="120" w:line="276" w:lineRule="auto"/>
-              <w:jc w:val="center"/>
-              <w:cnfStyle w:val="000000100000" w:firstRow="0" w:lastRow="0" w:firstColumn="0" w:lastColumn="0" w:oddVBand="0" w:evenVBand="0" w:oddHBand="1" w:evenHBand="0" w:firstRowFirstColumn="0" w:firstRowLastColumn="0" w:lastRowFirstColumn="0" w:lastRowLastColumn="0"/>
-              <w:rPr>
-                <w:rFonts w:cs="Segoe UI"/>
-              </w:rPr>
-            </w:pPr>
-            <w:r>
-              <w:rPr>
-                <w:rFonts w:cs="Segoe UI"/>
-              </w:rPr>
-              <w:t>40.9</w:t>
-            </w:r>
-          </w:p>
-        </w:tc>
-        <w:tc>
-          <w:tcPr>
-            <w:tcW w:w="0" w:type="auto"/>
-            <w:vAlign w:val="center"/>
-            <w:hideMark/>
-          </w:tcPr>
-          <w:p>
-            <w:pPr>
-              <w:spacing w:after="120" w:line="276" w:lineRule="auto"/>
-              <w:jc w:val="center"/>
-              <w:cnfStyle w:val="000000100000" w:firstRow="0" w:lastRow="0" w:firstColumn="0" w:lastColumn="0" w:oddVBand="0" w:evenVBand="0" w:oddHBand="1" w:evenHBand="0" w:firstRowFirstColumn="0" w:firstRowLastColumn="0" w:lastRowFirstColumn="0" w:lastRowLastColumn="0"/>
-              <w:rPr>
-                <w:rFonts w:cs="Segoe UI"/>
-              </w:rPr>
-            </w:pPr>
-            <w:r>
-              <w:rPr>
-                <w:rFonts w:cs="Segoe UI"/>
-                <w:b/>
-                <w:bCs/>
-              </w:rPr>
-              <w:t>3.32</w:t>
-            </w:r>
-          </w:p>
-        </w:tc>
-        <w:tc>
-          <w:tcPr>
-            <w:tcW w:w="0" w:type="auto"/>
-            <w:vAlign w:val="center"/>
-            <w:hideMark/>
-          </w:tcPr>
-          <w:p>
-            <w:pPr>
-              <w:spacing w:after="120" w:line="276" w:lineRule="auto"/>
-              <w:jc w:val="center"/>
-              <w:cnfStyle w:val="000000100000" w:firstRow="0" w:lastRow="0" w:firstColumn="0" w:lastColumn="0" w:oddVBand="0" w:evenVBand="0" w:oddHBand="1" w:evenHBand="0" w:firstRowFirstColumn="0" w:firstRowLastColumn="0" w:lastRowFirstColumn="0" w:lastRowLastColumn="0"/>
-              <w:rPr>
-                <w:rFonts w:cs="Segoe UI"/>
-              </w:rPr>
-            </w:pPr>
-            <w:r>
-              <w:rPr>
-                <w:rFonts w:cs="Segoe UI"/>
-                <w:b/>
-                <w:bCs/>
-              </w:rPr>
-              <w:t>8.15</w:t>
-            </w:r>
-          </w:p>
-        </w:tc>
-        <w:tc>
-          <w:tcPr>
-            <w:tcW w:w="0" w:type="auto"/>
-            <w:vAlign w:val="center"/>
-            <w:hideMark/>
-          </w:tcPr>
-          <w:p>
-            <w:pPr>
-              <w:spacing w:after="120" w:line="276" w:lineRule="auto"/>
-              <w:jc w:val="center"/>
-              <w:cnfStyle w:val="000000100000" w:firstRow="0" w:lastRow="0" w:firstColumn="0" w:lastColumn="0" w:oddVBand="0" w:evenVBand="0" w:oddHBand="1" w:evenHBand="0" w:firstRowFirstColumn="0" w:firstRowLastColumn="0" w:lastRowFirstColumn="0" w:lastRowLastColumn="0"/>
-              <w:rPr>
-                <w:rFonts w:cs="Segoe UI"/>
-              </w:rPr>
-            </w:pPr>
-            <w:r>
-              <w:rPr>
-                <w:rFonts w:cs="Segoe UI"/>
-              </w:rPr>
-              <w:t>47</w:t>
-            </w:r>
-          </w:p>
-        </w:tc>
-        <w:tc>
-          <w:tcPr>
-            <w:tcW w:w="0" w:type="auto"/>
-            <w:vAlign w:val="center"/>
-            <w:hideMark/>
-          </w:tcPr>
-          <w:p>
-            <w:pPr>
-              <w:spacing w:after="120" w:line="276" w:lineRule="auto"/>
-              <w:jc w:val="center"/>
-              <w:cnfStyle w:val="000000100000" w:firstRow="0" w:lastRow="0" w:firstColumn="0" w:lastColumn="0" w:oddVBand="0" w:evenVBand="0" w:oddHBand="1" w:evenHBand="0" w:firstRowFirstColumn="0" w:firstRowLastColumn="0" w:lastRowFirstColumn="0" w:lastRowLastColumn="0"/>
-              <w:rPr>
-                <w:rFonts w:cs="Segoe UI"/>
-              </w:rPr>
-            </w:pPr>
-            <w:r>
-              <w:rPr>
-                <w:rFonts w:cs="Segoe UI"/>
-              </w:rPr>
-              <w:t>נכסים גדולים לקבוצות</w:t>
-            </w:r>
-          </w:p>
-        </w:tc>
-        <w:tc>
-          <w:tcPr>
-            <w:tcW w:w="0" w:type="auto"/>
-            <w:vAlign w:val="center"/>
-            <w:hideMark/>
-          </w:tcPr>
-          <w:p>
-            <w:pPr>
-              <w:spacing w:after="120" w:line="276" w:lineRule="auto"/>
-              <w:jc w:val="center"/>
-              <w:cnfStyle w:val="000000100000" w:firstRow="0" w:lastRow="0" w:firstColumn="0" w:lastColumn="0" w:oddVBand="0" w:evenVBand="0" w:oddHBand="1" w:evenHBand="0" w:firstRowFirstColumn="0" w:firstRowLastColumn="0" w:lastRowFirstColumn="0" w:lastRowLastColumn="0"/>
-              <w:rPr>
-                <w:rFonts w:cs="Segoe UI"/>
-              </w:rPr>
-            </w:pPr>
-            <w:r>
-              <w:rPr>
-                <w:rFonts w:cs="Segoe UI"/>
-              </w:rPr>
-              <w:t>2</w:t>
-            </w:r>
-          </w:p>
-        </w:tc>
-      </w:tr>
-      <w:tr>
-        <w:tc>
-          <w:tcPr>
-            <w:cnfStyle w:val="001000000000" w:firstRow="0" w:lastRow="0" w:firstColumn="1" w:lastColumn="0" w:oddVBand="0" w:evenVBand="0" w:oddHBand="0" w:evenHBand="0" w:firstRowFirstColumn="0" w:firstRowLastColumn="0" w:lastRowFirstColumn="0" w:lastRowLastColumn="0"/>
-            <w:tcW w:w="0" w:type="auto"/>
-            <w:vAlign w:val="center"/>
-            <w:hideMark/>
-          </w:tcPr>
-          <w:p>
-            <w:pPr>
-              <w:spacing w:after="120" w:line="276" w:lineRule="auto"/>
-              <w:jc w:val="center"/>
-              <w:rPr>
-                <w:rFonts w:cs="Segoe UI"/>
-              </w:rPr>
-            </w:pPr>
-            <w:r>
-              <w:rPr>
-                <w:rFonts w:cs="Segoe UI"/>
-              </w:rPr>
-              <w:t>83.3% דירה שלמה</w:t>
-            </w:r>
-          </w:p>
-        </w:tc>
-        <w:tc>
-          <w:tcPr>
-            <w:tcW w:w="0" w:type="auto"/>
-            <w:vAlign w:val="center"/>
-            <w:hideMark/>
-          </w:tcPr>
-          <w:p>
-            <w:pPr>
-              <w:spacing w:after="120" w:line="276" w:lineRule="auto"/>
-              <w:jc w:val="center"/>
-              <w:cnfStyle w:val="000000000000" w:firstRow="0" w:lastRow="0" w:firstColumn="0" w:lastColumn="0" w:oddVBand="0" w:evenVBand="0" w:oddHBand="0" w:evenHBand="0" w:firstRowFirstColumn="0" w:firstRowLastColumn="0" w:lastRowFirstColumn="0" w:lastRowLastColumn="0"/>
-              <w:rPr>
-                <w:rFonts w:cs="Segoe UI"/>
-              </w:rPr>
-            </w:pPr>
-            <w:r>
-              <w:rPr>
-                <w:rFonts w:cs="Segoe UI"/>
-                <w:b/>
-                <w:bCs/>
-              </w:rPr>
-              <w:t>21.2</w:t>
-            </w:r>
-          </w:p>
-        </w:tc>
-        <w:tc>
-          <w:tcPr>
-            <w:tcW w:w="0" w:type="auto"/>
-            <w:vAlign w:val="center"/>
-            <w:hideMark/>
-          </w:tcPr>
-          <w:p>
-            <w:pPr>
-              <w:spacing w:after="120" w:line="276" w:lineRule="auto"/>
-              <w:jc w:val="center"/>
-              <w:cnfStyle w:val="000000000000" w:firstRow="0" w:lastRow="0" w:firstColumn="0" w:lastColumn="0" w:oddVBand="0" w:evenVBand="0" w:oddHBand="0" w:evenHBand="0" w:firstRowFirstColumn="0" w:firstRowLastColumn="0" w:lastRowFirstColumn="0" w:lastRowLastColumn="0"/>
-              <w:rPr>
-                <w:rFonts w:cs="Segoe UI"/>
-              </w:rPr>
-            </w:pPr>
-            <w:r>
-              <w:rPr>
-                <w:rFonts w:cs="Segoe UI"/>
-                <w:b/>
-                <w:bCs/>
-              </w:rPr>
-              <w:t>98.4%</w:t>
-            </w:r>
-          </w:p>
-        </w:tc>
-        <w:tc>
-          <w:tcPr>
-            <w:tcW w:w="0" w:type="auto"/>
-            <w:vAlign w:val="center"/>
-            <w:hideMark/>
-          </w:tcPr>
-          <w:p>
-            <w:pPr>
-              <w:spacing w:after="120" w:line="276" w:lineRule="auto"/>
-              <w:jc w:val="center"/>
-              <w:cnfStyle w:val="000000000000" w:firstRow="0" w:lastRow="0" w:firstColumn="0" w:lastColumn="0" w:oddVBand="0" w:evenVBand="0" w:oddHBand="0" w:evenHBand="0" w:firstRowFirstColumn="0" w:firstRowLastColumn="0" w:lastRowFirstColumn="0" w:lastRowLastColumn="0"/>
-              <w:rPr>
-                <w:rFonts w:cs="Segoe UI"/>
-              </w:rPr>
-            </w:pPr>
-            <w:r>
-              <w:rPr>
-                <w:rFonts w:cs="Segoe UI"/>
-                <w:b/>
-                <w:bCs/>
-              </w:rPr>
-              <w:t>36.6%</w:t>
-            </w:r>
-          </w:p>
-        </w:tc>
-        <w:tc>
-          <w:tcPr>
-            <w:tcW w:w="0" w:type="auto"/>
-            <w:vAlign w:val="center"/>
-            <w:hideMark/>
-          </w:tcPr>
-          <w:p>
-            <w:pPr>
-              <w:spacing w:after="120" w:line="276" w:lineRule="auto"/>
-              <w:jc w:val="center"/>
-              <w:cnfStyle w:val="000000000000" w:firstRow="0" w:lastRow="0" w:firstColumn="0" w:lastColumn="0" w:oddVBand="0" w:evenVBand="0" w:oddHBand="0" w:evenHBand="0" w:firstRowFirstColumn="0" w:firstRowLastColumn="0" w:lastRowFirstColumn="0" w:lastRowLastColumn="0"/>
-              <w:rPr>
-                <w:rFonts w:cs="Segoe UI"/>
-              </w:rPr>
-            </w:pPr>
-            <w:r>
-              <w:rPr>
-                <w:rFonts w:cs="Segoe UI"/>
-              </w:rPr>
-              <w:t>€120.8</w:t>
-            </w:r>
-          </w:p>
-        </w:tc>
-        <w:tc>
-          <w:tcPr>
-            <w:tcW w:w="0" w:type="auto"/>
-            <w:vAlign w:val="center"/>
-            <w:hideMark/>
-          </w:tcPr>
-          <w:p>
-            <w:pPr>
-              <w:spacing w:after="120" w:line="276" w:lineRule="auto"/>
-              <w:jc w:val="center"/>
-              <w:cnfStyle w:val="000000000000" w:firstRow="0" w:lastRow="0" w:firstColumn="0" w:lastColumn="0" w:oddVBand="0" w:evenVBand="0" w:oddHBand="0" w:evenHBand="0" w:firstRowFirstColumn="0" w:firstRowLastColumn="0" w:lastRowFirstColumn="0" w:lastRowLastColumn="0"/>
-              <w:rPr>
-                <w:rFonts w:cs="Segoe UI"/>
-              </w:rPr>
-            </w:pPr>
-            <w:r>
-              <w:rPr>
-                <w:rFonts w:cs="Segoe UI"/>
-              </w:rPr>
-              <w:t>€75.3</w:t>
-            </w:r>
-          </w:p>
-        </w:tc>
-        <w:tc>
-          <w:tcPr>
-            <w:tcW w:w="0" w:type="auto"/>
-            <w:vAlign w:val="center"/>
-            <w:hideMark/>
-          </w:tcPr>
-          <w:p>
-            <w:pPr>
-              <w:spacing w:after="120" w:line="276" w:lineRule="auto"/>
-              <w:jc w:val="center"/>
-              <w:cnfStyle w:val="000000000000" w:firstRow="0" w:lastRow="0" w:firstColumn="0" w:lastColumn="0" w:oddVBand="0" w:evenVBand="0" w:oddHBand="0" w:evenHBand="0" w:firstRowFirstColumn="0" w:firstRowLastColumn="0" w:lastRowFirstColumn="0" w:lastRowLastColumn="0"/>
-              <w:rPr>
-                <w:rFonts w:cs="Segoe UI"/>
-              </w:rPr>
-            </w:pPr>
-            <w:r>
-              <w:rPr>
-                <w:rFonts w:cs="Segoe UI"/>
-              </w:rPr>
-              <w:t>29.4</w:t>
-            </w:r>
-          </w:p>
-        </w:tc>
-        <w:tc>
-          <w:tcPr>
-            <w:tcW w:w="0" w:type="auto"/>
-            <w:vAlign w:val="center"/>
-            <w:hideMark/>
-          </w:tcPr>
-          <w:p>
-            <w:pPr>
-              <w:spacing w:after="120" w:line="276" w:lineRule="auto"/>
-              <w:jc w:val="center"/>
-              <w:cnfStyle w:val="000000000000" w:firstRow="0" w:lastRow="0" w:firstColumn="0" w:lastColumn="0" w:oddVBand="0" w:evenVBand="0" w:oddHBand="0" w:evenHBand="0" w:firstRowFirstColumn="0" w:firstRowLastColumn="0" w:lastRowFirstColumn="0" w:lastRowLastColumn="0"/>
-              <w:rPr>
-                <w:rFonts w:cs="Segoe UI"/>
-              </w:rPr>
-            </w:pPr>
-            <w:r>
-              <w:rPr>
-                <w:rFonts w:cs="Segoe UI"/>
-              </w:rPr>
-              <w:t>1.83</w:t>
-            </w:r>
-          </w:p>
-        </w:tc>
-        <w:tc>
-          <w:tcPr>
-            <w:tcW w:w="0" w:type="auto"/>
-            <w:vAlign w:val="center"/>
-            <w:hideMark/>
-          </w:tcPr>
-          <w:p>
-            <w:pPr>
-              <w:spacing w:after="120" w:line="276" w:lineRule="auto"/>
-              <w:jc w:val="center"/>
-              <w:cnfStyle w:val="000000000000" w:firstRow="0" w:lastRow="0" w:firstColumn="0" w:lastColumn="0" w:oddVBand="0" w:evenVBand="0" w:oddHBand="0" w:evenHBand="0" w:firstRowFirstColumn="0" w:firstRowLastColumn="0" w:lastRowFirstColumn="0" w:lastRowLastColumn="0"/>
-              <w:rPr>
-                <w:rFonts w:cs="Segoe UI"/>
-              </w:rPr>
-            </w:pPr>
-            <w:r>
-              <w:rPr>
-                <w:rFonts w:cs="Segoe UI"/>
-              </w:rPr>
-              <w:t>4.56</w:t>
-            </w:r>
-          </w:p>
-        </w:tc>
-        <w:tc>
-          <w:tcPr>
-            <w:tcW w:w="0" w:type="auto"/>
-            <w:vAlign w:val="center"/>
-            <w:hideMark/>
-          </w:tcPr>
-          <w:p>
-            <w:pPr>
-              <w:spacing w:after="120" w:line="276" w:lineRule="auto"/>
-              <w:jc w:val="center"/>
-              <w:cnfStyle w:val="000000000000" w:firstRow="0" w:lastRow="0" w:firstColumn="0" w:lastColumn="0" w:oddVBand="0" w:evenVBand="0" w:oddHBand="0" w:evenHBand="0" w:firstRowFirstColumn="0" w:firstRowLastColumn="0" w:lastRowFirstColumn="0" w:lastRowLastColumn="0"/>
-              <w:rPr>
-                <w:rFonts w:cs="Segoe UI"/>
-              </w:rPr>
-            </w:pPr>
-            <w:r>
-              <w:rPr>
-                <w:rFonts w:cs="Segoe UI"/>
-              </w:rPr>
-              <w:t>18</w:t>
-            </w:r>
-          </w:p>
-        </w:tc>
-        <w:tc>
-          <w:tcPr>
-            <w:tcW w:w="0" w:type="auto"/>
-            <w:vAlign w:val="center"/>
-            <w:hideMark/>
-          </w:tcPr>
-          <w:p>
-            <w:pPr>
-              <w:spacing w:after="120" w:line="276" w:lineRule="auto"/>
-              <w:jc w:val="center"/>
-              <w:cnfStyle w:val="000000000000" w:firstRow="0" w:lastRow="0" w:firstColumn="0" w:lastColumn="0" w:oddVBand="0" w:evenVBand="0" w:oddHBand="0" w:evenHBand="0" w:firstRowFirstColumn="0" w:firstRowLastColumn="0" w:lastRowFirstColumn="0" w:lastRowLastColumn="0"/>
-              <w:rPr>
-                <w:rFonts w:cs="Segoe UI"/>
-              </w:rPr>
-            </w:pPr>
-            <w:proofErr w:type="spellStart"/>
-            <w:r>
-              <w:rPr>
-                <w:rFonts w:cs="Segoe UI"/>
-              </w:rPr>
-              <w:t>פנינות</w:t>
-            </w:r>
-            <w:proofErr w:type="spellEnd"/>
-            <w:r>
-              <w:rPr>
-                <w:rFonts w:cs="Segoe UI"/>
-              </w:rPr>
-              <w:t xml:space="preserve"> החוף השקטות (</w:t>
-            </w:r>
-            <w:proofErr w:type="spellStart"/>
-            <w:r>
-              <w:rPr>
-                <w:rFonts w:cs="Segoe UI"/>
-              </w:rPr>
-              <w:t>אוסטיה</w:t>
-            </w:r>
-            <w:proofErr w:type="spellEnd"/>
-            <w:r>
-              <w:rPr>
-                <w:rFonts w:cs="Segoe UI"/>
-              </w:rPr>
-              <w:t>/</w:t>
-            </w:r>
-            <w:proofErr w:type="spellStart"/>
-            <w:r>
-              <w:rPr>
-                <w:rFonts w:cs="Segoe UI"/>
-              </w:rPr>
-              <w:t>אצ'יליה</w:t>
-            </w:r>
-            <w:proofErr w:type="spellEnd"/>
-            <w:r>
-              <w:rPr>
-                <w:rFonts w:cs="Segoe UI"/>
-              </w:rPr>
-              <w:t>)</w:t>
-            </w:r>
-          </w:p>
-        </w:tc>
-        <w:tc>
-          <w:tcPr>
-            <w:tcW w:w="0" w:type="auto"/>
-            <w:vAlign w:val="center"/>
-            <w:hideMark/>
-          </w:tcPr>
-          <w:p>
-            <w:pPr>
-              <w:spacing w:after="120" w:line="276" w:lineRule="auto"/>
-              <w:jc w:val="center"/>
-              <w:cnfStyle w:val="000000000000" w:firstRow="0" w:lastRow="0" w:firstColumn="0" w:lastColumn="0" w:oddVBand="0" w:evenVBand="0" w:oddHBand="0" w:evenHBand="0" w:firstRowFirstColumn="0" w:firstRowLastColumn="0" w:lastRowFirstColumn="0" w:lastRowLastColumn="0"/>
-              <w:rPr>
-                <w:rFonts w:cs="Segoe UI"/>
-              </w:rPr>
-            </w:pPr>
-            <w:r>
-              <w:rPr>
-                <w:rFonts w:cs="Segoe UI"/>
-              </w:rPr>
-              <w:t>0</w:t>
-            </w:r>
-          </w:p>
-        </w:tc>
-      </w:tr>
-    </w:tbl>
-    <w:p>
-      <w:pPr>
-        <w:spacing w:after="120"/>
-        <w:rPr>
-          <w:rFonts w:cs="Segoe UI"/>
-        </w:rPr>
-      </w:pPr>
-    </w:p>
-    <w:p>
-      <w:pPr>
-        <w:spacing w:after="120"/>
-      </w:pPr>
-      <w:r>
-        <w:rPr>
-          <w:rFonts w:cs="Segoe UI"/>
-        </w:rPr>
-        <w:t>עוצמת הממצא ניכרת במרחקים הגיאוגרפיים: שלוש מתוך ארבע הקבוצות ממוקמות למעשה באותו אזור במרכז רומא, כאשר מרכזי הקבוצות שלהן מרוחקים פחות מקילומטר זה מזה. הקבוצה הרביעית היא היחידה שנבדלת גיאוגרפית, וממוקמת באזור החוף (כ-21 ק"מ ממרכז שאר הנכסים).</w:t>
-      </w:r>
-    </w:p>
-    <w:p>
-      <w:pPr>
-        <w:bidi w:val="0"/>
-        <w:rPr>
-          <w:rtl w:val="0"/>
-        </w:rPr>
-      </w:pPr>
-    </w:p>
-    <w:tbl>
-      <w:tblPr>
-        <w:tblStyle w:val="4-1"/>
-        <w:tblW w:w="0" w:type="auto"/>
-        <w:tblLook w:val="04A0" w:firstRow="1" w:lastRow="0" w:firstColumn="1" w:lastColumn="0" w:noHBand="0" w:noVBand="1"/>
-      </w:tblPr>
-      <w:tblGrid>
-        <w:gridCol w:w="1848"/>
-        <w:gridCol w:w="1369"/>
-        <w:gridCol w:w="840"/>
-        <w:gridCol w:w="1458"/>
-        <w:gridCol w:w="896"/>
-        <w:gridCol w:w="1048"/>
-        <w:gridCol w:w="1666"/>
-      </w:tblGrid>
-      <w:tr>
-        <w:trPr>
-          <w:cnfStyle w:val="100000000000" w:firstRow="1" w:lastRow="0" w:firstColumn="0" w:lastColumn="0" w:oddVBand="0" w:evenVBand="0" w:oddHBand="0" w:evenHBand="0" w:firstRowFirstColumn="0" w:firstRowLastColumn="0" w:lastRowFirstColumn="0" w:lastRowLastColumn="0"/>
-        </w:trPr>
-        <w:tc>
-          <w:tcPr>
-            <w:cnfStyle w:val="001000000000" w:firstRow="0" w:lastRow="0" w:firstColumn="1" w:lastColumn="0" w:oddVBand="0" w:evenVBand="0" w:oddHBand="0" w:evenHBand="0" w:firstRowFirstColumn="0" w:firstRowLastColumn="0" w:lastRowFirstColumn="0" w:lastRowLastColumn="0"/>
-            <w:tcW w:w="0" w:type="auto"/>
-            <w:hideMark/>
-          </w:tcPr>
-          <w:p>
-            <w:pPr>
-              <w:bidi w:val="0"/>
-              <w:spacing w:after="200" w:line="276" w:lineRule="auto"/>
-            </w:pPr>
-            <w:r>
-              <w:t>משתנה חיצוני</w:t>
-            </w:r>
-          </w:p>
-        </w:tc>
-        <w:tc>
-          <w:tcPr>
-            <w:tcW w:w="0" w:type="auto"/>
-            <w:hideMark/>
-          </w:tcPr>
-          <w:p>
-            <w:pPr>
-              <w:bidi w:val="0"/>
-              <w:spacing w:after="200" w:line="276" w:lineRule="auto"/>
-              <w:cnfStyle w:val="100000000000" w:firstRow="1" w:lastRow="0" w:firstColumn="0" w:lastColumn="0" w:oddVBand="0" w:evenVBand="0" w:oddHBand="0" w:evenHBand="0" w:firstRowFirstColumn="0" w:firstRowLastColumn="0" w:lastRowFirstColumn="0" w:lastRowLastColumn="0"/>
-            </w:pPr>
-            <w:r>
-              <w:t>תפקיד</w:t>
-            </w:r>
-          </w:p>
-        </w:tc>
-        <w:tc>
-          <w:tcPr>
-            <w:tcW w:w="0" w:type="auto"/>
-            <w:hideMark/>
-          </w:tcPr>
-          <w:p>
-            <w:pPr>
-              <w:bidi w:val="0"/>
-              <w:spacing w:after="200" w:line="276" w:lineRule="auto"/>
               <w:cnfStyle w:val="100000000000" w:firstRow="1" w:lastRow="0" w:firstColumn="0" w:lastColumn="0" w:oddVBand="0" w:evenVBand="0" w:oddHBand="0" w:evenHBand="0" w:firstRowFirstColumn="0" w:firstRowLastColumn="0" w:lastRowFirstColumn="0" w:lastRowLastColumn="0"/>
             </w:pPr>
             <w:proofErr w:type="spellStart"/>
@@ -6944,12 +5657,13 @@
         <w:tc>
           <w:tcPr>
             <w:tcW w:w="0" w:type="auto"/>
+            <w:vAlign w:val="center"/>
             <w:hideMark/>
           </w:tcPr>
           <w:p>
             <w:pPr>
-              <w:bidi w:val="0"/>
               <w:spacing w:after="200" w:line="276" w:lineRule="auto"/>
+              <w:jc w:val="center"/>
               <w:cnfStyle w:val="100000000000" w:firstRow="1" w:lastRow="0" w:firstColumn="0" w:lastColumn="0" w:oddVBand="0" w:evenVBand="0" w:oddHBand="0" w:evenHBand="0" w:firstRowFirstColumn="0" w:firstRowLastColumn="0" w:lastRowFirstColumn="0" w:lastRowLastColumn="0"/>
             </w:pPr>
             <w:proofErr w:type="spellStart"/>
@@ -6965,13 +5679,17 @@
         <w:tc>
           <w:tcPr>
             <w:tcW w:w="0" w:type="auto"/>
+            <w:vAlign w:val="center"/>
             <w:hideMark/>
           </w:tcPr>
           <w:p>
             <w:pPr>
-              <w:bidi w:val="0"/>
               <w:spacing w:after="200" w:line="276" w:lineRule="auto"/>
+              <w:jc w:val="center"/>
               <w:cnfStyle w:val="100000000000" w:firstRow="1" w:lastRow="0" w:firstColumn="0" w:lastColumn="0" w:oddVBand="0" w:evenVBand="0" w:oddHBand="0" w:evenHBand="0" w:firstRowFirstColumn="0" w:firstRowLastColumn="0" w:lastRowFirstColumn="0" w:lastRowLastColumn="0"/>
+              <w:rPr>
+                <w:rtl w:val="0"/>
+              </w:rPr>
             </w:pPr>
             <w:r>
               <w:t>הפרש</w:t>
@@ -6981,12 +5699,13 @@
         <w:tc>
           <w:tcPr>
             <w:tcW w:w="0" w:type="auto"/>
+            <w:vAlign w:val="center"/>
             <w:hideMark/>
           </w:tcPr>
           <w:p>
             <w:pPr>
-              <w:bidi w:val="0"/>
               <w:spacing w:after="200" w:line="276" w:lineRule="auto"/>
+              <w:jc w:val="center"/>
               <w:cnfStyle w:val="100000000000" w:firstRow="1" w:lastRow="0" w:firstColumn="0" w:lastColumn="0" w:oddVBand="0" w:evenVBand="0" w:oddHBand="0" w:evenHBand="0" w:firstRowFirstColumn="0" w:firstRowLastColumn="0" w:lastRowFirstColumn="0" w:lastRowLastColumn="0"/>
             </w:pPr>
             <w:proofErr w:type="spellStart"/>
@@ -6999,12 +5718,13 @@
         <w:tc>
           <w:tcPr>
             <w:tcW w:w="0" w:type="auto"/>
+            <w:vAlign w:val="center"/>
             <w:hideMark/>
           </w:tcPr>
           <w:p>
             <w:pPr>
-              <w:bidi w:val="0"/>
               <w:spacing w:after="200" w:line="276" w:lineRule="auto"/>
+              <w:jc w:val="center"/>
               <w:cnfStyle w:val="100000000000" w:firstRow="1" w:lastRow="0" w:firstColumn="0" w:lastColumn="0" w:oddVBand="0" w:evenVBand="0" w:oddHBand="0" w:evenHBand="0" w:firstRowFirstColumn="0" w:firstRowLastColumn="0" w:lastRowFirstColumn="0" w:lastRowLastColumn="0"/>
             </w:pPr>
             <w:proofErr w:type="spellStart"/>
@@ -7021,17 +5741,19 @@
       <w:tr>
         <w:trPr>
           <w:cnfStyle w:val="000000100000" w:firstRow="0" w:lastRow="0" w:firstColumn="0" w:lastColumn="0" w:oddVBand="0" w:evenVBand="0" w:oddHBand="1" w:evenHBand="0" w:firstRowFirstColumn="0" w:firstRowLastColumn="0" w:lastRowFirstColumn="0" w:lastRowLastColumn="0"/>
+          <w:trHeight w:val="523"/>
         </w:trPr>
         <w:tc>
           <w:tcPr>
             <w:cnfStyle w:val="001000000000" w:firstRow="0" w:lastRow="0" w:firstColumn="1" w:lastColumn="0" w:oddVBand="0" w:evenVBand="0" w:oddHBand="0" w:evenHBand="0" w:firstRowFirstColumn="0" w:firstRowLastColumn="0" w:lastRowFirstColumn="0" w:lastRowLastColumn="0"/>
             <w:tcW w:w="0" w:type="auto"/>
+            <w:vAlign w:val="center"/>
             <w:hideMark/>
           </w:tcPr>
           <w:p>
             <w:pPr>
-              <w:bidi w:val="0"/>
               <w:spacing w:after="200" w:line="276" w:lineRule="auto"/>
+              <w:jc w:val="center"/>
             </w:pPr>
             <w:r>
               <w:t>שלישון מחיר</w:t>
@@ -7041,12 +5763,13 @@
         <w:tc>
           <w:tcPr>
             <w:tcW w:w="0" w:type="auto"/>
+            <w:vAlign w:val="center"/>
             <w:hideMark/>
           </w:tcPr>
           <w:p>
             <w:pPr>
-              <w:bidi w:val="0"/>
               <w:spacing w:after="200" w:line="276" w:lineRule="auto"/>
+              <w:jc w:val="center"/>
               <w:cnfStyle w:val="000000100000" w:firstRow="0" w:lastRow="0" w:firstColumn="0" w:lastColumn="0" w:oddVBand="0" w:evenVBand="0" w:oddHBand="1" w:evenHBand="0" w:firstRowFirstColumn="0" w:firstRowLastColumn="0" w:lastRowFirstColumn="0" w:lastRowLastColumn="0"/>
             </w:pPr>
             <w:r>
@@ -7057,12 +5780,13 @@
         <w:tc>
           <w:tcPr>
             <w:tcW w:w="0" w:type="auto"/>
+            <w:vAlign w:val="center"/>
             <w:hideMark/>
           </w:tcPr>
           <w:p>
             <w:pPr>
-              <w:bidi w:val="0"/>
               <w:spacing w:after="200" w:line="276" w:lineRule="auto"/>
+              <w:jc w:val="center"/>
               <w:cnfStyle w:val="000000100000" w:firstRow="0" w:lastRow="0" w:firstColumn="0" w:lastColumn="0" w:oddVBand="0" w:evenVBand="0" w:oddHBand="1" w:evenHBand="0" w:firstRowFirstColumn="0" w:firstRowLastColumn="0" w:lastRowFirstColumn="0" w:lastRowLastColumn="0"/>
             </w:pPr>
             <w:r>
@@ -7073,12 +5797,13 @@
         <w:tc>
           <w:tcPr>
             <w:tcW w:w="0" w:type="auto"/>
+            <w:vAlign w:val="center"/>
             <w:hideMark/>
           </w:tcPr>
           <w:p>
             <w:pPr>
-              <w:bidi w:val="0"/>
               <w:spacing w:after="200" w:line="276" w:lineRule="auto"/>
+              <w:jc w:val="center"/>
               <w:cnfStyle w:val="000000100000" w:firstRow="0" w:lastRow="0" w:firstColumn="0" w:lastColumn="0" w:oddVBand="0" w:evenVBand="0" w:oddHBand="1" w:evenHBand="0" w:firstRowFirstColumn="0" w:firstRowLastColumn="0" w:lastRowFirstColumn="0" w:lastRowLastColumn="0"/>
             </w:pPr>
             <w:r>
@@ -7089,12 +5814,13 @@
         <w:tc>
           <w:tcPr>
             <w:tcW w:w="0" w:type="auto"/>
+            <w:vAlign w:val="center"/>
             <w:hideMark/>
           </w:tcPr>
           <w:p>
             <w:pPr>
-              <w:bidi w:val="0"/>
               <w:spacing w:after="200" w:line="276" w:lineRule="auto"/>
+              <w:jc w:val="center"/>
               <w:cnfStyle w:val="000000100000" w:firstRow="0" w:lastRow="0" w:firstColumn="0" w:lastColumn="0" w:oddVBand="0" w:evenVBand="0" w:oddHBand="1" w:evenHBand="0" w:firstRowFirstColumn="0" w:firstRowLastColumn="0" w:lastRowFirstColumn="0" w:lastRowLastColumn="0"/>
             </w:pPr>
             <w:r>
@@ -7109,12 +5835,13 @@
         <w:tc>
           <w:tcPr>
             <w:tcW w:w="0" w:type="auto"/>
+            <w:vAlign w:val="center"/>
             <w:hideMark/>
           </w:tcPr>
           <w:p>
             <w:pPr>
-              <w:bidi w:val="0"/>
               <w:spacing w:after="200" w:line="276" w:lineRule="auto"/>
+              <w:jc w:val="center"/>
               <w:cnfStyle w:val="000000100000" w:firstRow="0" w:lastRow="0" w:firstColumn="0" w:lastColumn="0" w:oddVBand="0" w:evenVBand="0" w:oddHBand="1" w:evenHBand="0" w:firstRowFirstColumn="0" w:firstRowLastColumn="0" w:lastRowFirstColumn="0" w:lastRowLastColumn="0"/>
             </w:pPr>
             <w:r>
@@ -7125,13 +5852,17 @@
         <w:tc>
           <w:tcPr>
             <w:tcW w:w="0" w:type="auto"/>
+            <w:vAlign w:val="center"/>
             <w:hideMark/>
           </w:tcPr>
           <w:p>
             <w:pPr>
-              <w:bidi w:val="0"/>
               <w:spacing w:after="200" w:line="276" w:lineRule="auto"/>
+              <w:jc w:val="center"/>
               <w:cnfStyle w:val="000000100000" w:firstRow="0" w:lastRow="0" w:firstColumn="0" w:lastColumn="0" w:oddVBand="0" w:evenVBand="0" w:oddHBand="1" w:evenHBand="0" w:firstRowFirstColumn="0" w:firstRowLastColumn="0" w:lastRowFirstColumn="0" w:lastRowLastColumn="0"/>
+              <w:rPr>
+                <w:rtl w:val="0"/>
+              </w:rPr>
             </w:pPr>
             <w:r>
               <w:t>0.994</w:t>
@@ -7140,16 +5871,20 @@
         </w:tc>
       </w:tr>
       <w:tr>
+        <w:trPr>
+          <w:trHeight w:val="532"/>
+        </w:trPr>
         <w:tc>
           <w:tcPr>
             <w:cnfStyle w:val="001000000000" w:firstRow="0" w:lastRow="0" w:firstColumn="1" w:lastColumn="0" w:oddVBand="0" w:evenVBand="0" w:oddHBand="0" w:evenHBand="0" w:firstRowFirstColumn="0" w:firstRowLastColumn="0" w:lastRowFirstColumn="0" w:lastRowLastColumn="0"/>
             <w:tcW w:w="0" w:type="auto"/>
+            <w:vAlign w:val="center"/>
             <w:hideMark/>
           </w:tcPr>
           <w:p>
             <w:pPr>
-              <w:bidi w:val="0"/>
               <w:spacing w:after="200" w:line="276" w:lineRule="auto"/>
+              <w:jc w:val="center"/>
             </w:pPr>
             <w:proofErr w:type="spellStart"/>
             <w:r>
@@ -7161,12 +5896,13 @@
         <w:tc>
           <w:tcPr>
             <w:tcW w:w="0" w:type="auto"/>
+            <w:vAlign w:val="center"/>
             <w:hideMark/>
           </w:tcPr>
           <w:p>
             <w:pPr>
-              <w:bidi w:val="0"/>
               <w:spacing w:after="200" w:line="276" w:lineRule="auto"/>
+              <w:jc w:val="center"/>
               <w:cnfStyle w:val="000000000000" w:firstRow="0" w:lastRow="0" w:firstColumn="0" w:lastColumn="0" w:oddVBand="0" w:evenVBand="0" w:oddHBand="0" w:evenHBand="0" w:firstRowFirstColumn="0" w:firstRowLastColumn="0" w:lastRowFirstColumn="0" w:lastRowLastColumn="0"/>
             </w:pPr>
             <w:r>
@@ -7177,12 +5913,13 @@
         <w:tc>
           <w:tcPr>
             <w:tcW w:w="0" w:type="auto"/>
+            <w:vAlign w:val="center"/>
             <w:hideMark/>
           </w:tcPr>
           <w:p>
             <w:pPr>
-              <w:bidi w:val="0"/>
               <w:spacing w:after="200" w:line="276" w:lineRule="auto"/>
+              <w:jc w:val="center"/>
               <w:cnfStyle w:val="000000000000" w:firstRow="0" w:lastRow="0" w:firstColumn="0" w:lastColumn="0" w:oddVBand="0" w:evenVBand="0" w:oddHBand="0" w:evenHBand="0" w:firstRowFirstColumn="0" w:firstRowLastColumn="0" w:lastRowFirstColumn="0" w:lastRowLastColumn="0"/>
             </w:pPr>
             <w:r>
@@ -7193,12 +5930,13 @@
         <w:tc>
           <w:tcPr>
             <w:tcW w:w="0" w:type="auto"/>
+            <w:vAlign w:val="center"/>
             <w:hideMark/>
           </w:tcPr>
           <w:p>
             <w:pPr>
-              <w:bidi w:val="0"/>
               <w:spacing w:after="200" w:line="276" w:lineRule="auto"/>
+              <w:jc w:val="center"/>
               <w:cnfStyle w:val="000000000000" w:firstRow="0" w:lastRow="0" w:firstColumn="0" w:lastColumn="0" w:oddVBand="0" w:evenVBand="0" w:oddHBand="0" w:evenHBand="0" w:firstRowFirstColumn="0" w:firstRowLastColumn="0" w:lastRowFirstColumn="0" w:lastRowLastColumn="0"/>
             </w:pPr>
             <w:r>
@@ -7209,12 +5947,13 @@
         <w:tc>
           <w:tcPr>
             <w:tcW w:w="0" w:type="auto"/>
+            <w:vAlign w:val="center"/>
             <w:hideMark/>
           </w:tcPr>
           <w:p>
             <w:pPr>
-              <w:bidi w:val="0"/>
               <w:spacing w:after="200" w:line="276" w:lineRule="auto"/>
+              <w:jc w:val="center"/>
               <w:cnfStyle w:val="000000000000" w:firstRow="0" w:lastRow="0" w:firstColumn="0" w:lastColumn="0" w:oddVBand="0" w:evenVBand="0" w:oddHBand="0" w:evenHBand="0" w:firstRowFirstColumn="0" w:firstRowLastColumn="0" w:lastRowFirstColumn="0" w:lastRowLastColumn="0"/>
             </w:pPr>
             <w:r>
@@ -7225,12 +5964,13 @@
         <w:tc>
           <w:tcPr>
             <w:tcW w:w="0" w:type="auto"/>
+            <w:vAlign w:val="center"/>
             <w:hideMark/>
           </w:tcPr>
           <w:p>
             <w:pPr>
-              <w:bidi w:val="0"/>
               <w:spacing w:after="200" w:line="276" w:lineRule="auto"/>
+              <w:jc w:val="center"/>
               <w:cnfStyle w:val="000000000000" w:firstRow="0" w:lastRow="0" w:firstColumn="0" w:lastColumn="0" w:oddVBand="0" w:evenVBand="0" w:oddHBand="0" w:evenHBand="0" w:firstRowFirstColumn="0" w:firstRowLastColumn="0" w:lastRowFirstColumn="0" w:lastRowLastColumn="0"/>
             </w:pPr>
             <w:r>
@@ -7245,12 +5985,13 @@
         <w:tc>
           <w:tcPr>
             <w:tcW w:w="0" w:type="auto"/>
+            <w:vAlign w:val="center"/>
             <w:hideMark/>
           </w:tcPr>
           <w:p>
             <w:pPr>
-              <w:bidi w:val="0"/>
               <w:spacing w:after="200" w:line="276" w:lineRule="auto"/>
+              <w:jc w:val="center"/>
               <w:cnfStyle w:val="000000000000" w:firstRow="0" w:lastRow="0" w:firstColumn="0" w:lastColumn="0" w:oddVBand="0" w:evenVBand="0" w:oddHBand="0" w:evenHBand="0" w:firstRowFirstColumn="0" w:firstRowLastColumn="0" w:lastRowFirstColumn="0" w:lastRowLastColumn="0"/>
             </w:pPr>
             <w:r>
@@ -7262,17 +6003,19 @@
       <w:tr>
         <w:trPr>
           <w:cnfStyle w:val="000000100000" w:firstRow="0" w:lastRow="0" w:firstColumn="0" w:lastColumn="0" w:oddVBand="0" w:evenVBand="0" w:oddHBand="1" w:evenHBand="0" w:firstRowFirstColumn="0" w:firstRowLastColumn="0" w:lastRowFirstColumn="0" w:lastRowLastColumn="0"/>
+          <w:trHeight w:val="523"/>
         </w:trPr>
         <w:tc>
           <w:tcPr>
             <w:cnfStyle w:val="001000000000" w:firstRow="0" w:lastRow="0" w:firstColumn="1" w:lastColumn="0" w:oddVBand="0" w:evenVBand="0" w:oddHBand="0" w:evenHBand="0" w:firstRowFirstColumn="0" w:firstRowLastColumn="0" w:lastRowFirstColumn="0" w:lastRowLastColumn="0"/>
             <w:tcW w:w="0" w:type="auto"/>
+            <w:vAlign w:val="center"/>
             <w:hideMark/>
           </w:tcPr>
           <w:p>
             <w:pPr>
-              <w:bidi w:val="0"/>
               <w:spacing w:after="200" w:line="276" w:lineRule="auto"/>
+              <w:jc w:val="center"/>
             </w:pPr>
             <w:r>
               <w:t>שלישון אחוז הנחה</w:t>
@@ -7282,12 +6025,13 @@
         <w:tc>
           <w:tcPr>
             <w:tcW w:w="0" w:type="auto"/>
+            <w:vAlign w:val="center"/>
             <w:hideMark/>
           </w:tcPr>
           <w:p>
             <w:pPr>
-              <w:bidi w:val="0"/>
               <w:spacing w:after="200" w:line="276" w:lineRule="auto"/>
+              <w:jc w:val="center"/>
               <w:cnfStyle w:val="000000100000" w:firstRow="0" w:lastRow="0" w:firstColumn="0" w:lastColumn="0" w:oddVBand="0" w:evenVBand="0" w:oddHBand="1" w:evenHBand="0" w:firstRowFirstColumn="0" w:firstRowLastColumn="0" w:lastRowFirstColumn="0" w:lastRowLastColumn="0"/>
             </w:pPr>
             <w:r>
@@ -7298,12 +6042,13 @@
         <w:tc>
           <w:tcPr>
             <w:tcW w:w="0" w:type="auto"/>
+            <w:vAlign w:val="center"/>
             <w:hideMark/>
           </w:tcPr>
           <w:p>
             <w:pPr>
-              <w:bidi w:val="0"/>
               <w:spacing w:after="200" w:line="276" w:lineRule="auto"/>
+              <w:jc w:val="center"/>
               <w:cnfStyle w:val="000000100000" w:firstRow="0" w:lastRow="0" w:firstColumn="0" w:lastColumn="0" w:oddVBand="0" w:evenVBand="0" w:oddHBand="1" w:evenHBand="0" w:firstRowFirstColumn="0" w:firstRowLastColumn="0" w:lastRowFirstColumn="0" w:lastRowLastColumn="0"/>
             </w:pPr>
             <w:r>
@@ -7314,12 +6059,13 @@
         <w:tc>
           <w:tcPr>
             <w:tcW w:w="0" w:type="auto"/>
+            <w:vAlign w:val="center"/>
             <w:hideMark/>
           </w:tcPr>
           <w:p>
             <w:pPr>
-              <w:bidi w:val="0"/>
               <w:spacing w:after="200" w:line="276" w:lineRule="auto"/>
+              <w:jc w:val="center"/>
               <w:cnfStyle w:val="000000100000" w:firstRow="0" w:lastRow="0" w:firstColumn="0" w:lastColumn="0" w:oddVBand="0" w:evenVBand="0" w:oddHBand="1" w:evenHBand="0" w:firstRowFirstColumn="0" w:firstRowLastColumn="0" w:lastRowFirstColumn="0" w:lastRowLastColumn="0"/>
             </w:pPr>
             <w:r>
@@ -7330,12 +6076,13 @@
         <w:tc>
           <w:tcPr>
             <w:tcW w:w="0" w:type="auto"/>
+            <w:vAlign w:val="center"/>
             <w:hideMark/>
           </w:tcPr>
           <w:p>
             <w:pPr>
-              <w:bidi w:val="0"/>
               <w:spacing w:after="200" w:line="276" w:lineRule="auto"/>
+              <w:jc w:val="center"/>
               <w:cnfStyle w:val="000000100000" w:firstRow="0" w:lastRow="0" w:firstColumn="0" w:lastColumn="0" w:oddVBand="0" w:evenVBand="0" w:oddHBand="1" w:evenHBand="0" w:firstRowFirstColumn="0" w:firstRowLastColumn="0" w:lastRowFirstColumn="0" w:lastRowLastColumn="0"/>
             </w:pPr>
             <w:r>
@@ -7346,12 +6093,13 @@
         <w:tc>
           <w:tcPr>
             <w:tcW w:w="0" w:type="auto"/>
+            <w:vAlign w:val="center"/>
             <w:hideMark/>
           </w:tcPr>
           <w:p>
             <w:pPr>
-              <w:bidi w:val="0"/>
               <w:spacing w:after="200" w:line="276" w:lineRule="auto"/>
+              <w:jc w:val="center"/>
               <w:cnfStyle w:val="000000100000" w:firstRow="0" w:lastRow="0" w:firstColumn="0" w:lastColumn="0" w:oddVBand="0" w:evenVBand="0" w:oddHBand="1" w:evenHBand="0" w:firstRowFirstColumn="0" w:firstRowLastColumn="0" w:lastRowFirstColumn="0" w:lastRowLastColumn="0"/>
             </w:pPr>
             <w:r>
@@ -7362,12 +6110,13 @@
         <w:tc>
           <w:tcPr>
             <w:tcW w:w="0" w:type="auto"/>
+            <w:vAlign w:val="center"/>
             <w:hideMark/>
           </w:tcPr>
           <w:p>
             <w:pPr>
-              <w:bidi w:val="0"/>
               <w:spacing w:after="200" w:line="276" w:lineRule="auto"/>
+              <w:jc w:val="center"/>
               <w:cnfStyle w:val="000000100000" w:firstRow="0" w:lastRow="0" w:firstColumn="0" w:lastColumn="0" w:oddVBand="0" w:evenVBand="0" w:oddHBand="1" w:evenHBand="0" w:firstRowFirstColumn="0" w:firstRowLastColumn="0" w:lastRowFirstColumn="0" w:lastRowLastColumn="0"/>
             </w:pPr>
             <w:r>
@@ -7379,15 +6128,105 @@
     </w:tbl>
     <w:p>
       <w:pPr>
-        <w:bidi w:val="0"/>
-        <w:rPr>
+        <w:spacing w:after="120"/>
+        <w:rPr>
+          <w:rFonts w:cs="Segoe UI"/>
+        </w:rPr>
+      </w:pPr>
+      <w:r>
+        <w:rPr>
+          <w:rFonts w:cs="Segoe UI"/>
+        </w:rPr>
+        <w:t xml:space="preserve">כדי לוודא שהחלוקה משקפת מבנה אמיתי בנתונים ולא תוצר שרירותי, בחנו את האשכולות מול משתנים חיצוניים שלא הוזנו למודל (תוך פסילת משתנה השכונה שנגזר ישירות מנתוני המיקום). איכות האשכולות נמדדה באמצעות מדדי </w:t>
+      </w:r>
+      <w:r>
+        <w:rPr>
+          <w:rFonts w:cs="Segoe UI"/>
           <w:rtl w:val="0"/>
         </w:rPr>
-      </w:pPr>
+        <w:t>Purity</w:t>
+      </w:r>
+      <w:r>
+        <w:rPr>
+          <w:rFonts w:cs="Segoe UI"/>
+        </w:rPr>
+        <w:t xml:space="preserve"> ו-</w:t>
+      </w:r>
+      <w:r>
+        <w:rPr>
+          <w:rFonts w:cs="Segoe UI"/>
+          <w:rtl w:val="0"/>
+        </w:rPr>
+        <w:t>Entropy</w:t>
+      </w:r>
+      <w:r>
+        <w:rPr>
+          <w:rFonts w:cs="Segoe UI"/>
+        </w:rPr>
+        <w:t>, אשר הושוו לערך בסיס אקראי (ממוצע של 1,000 ערבובים) משום שערכם המוחלט מושפע מהתפלגות הנתונים המקורית ואינו ניתן לפרשנות בפני עצמו. הבחינה נשענה על תפקידים שהוגדרו מראש: שלישון המחיר וסוג החדר שימשו כבקרות חיוביות שבהן ציפינו למצוא קשר לחלוקה, בעוד ששלישון אחוז ההנחה שימש כבקרה שלילית שבה ציפינו במכוון שלא יימצא קשר – זאת כדי להוכיח שהאשכולות מתארים באופן טהור "טיפוסי נכס" פיזיים, ולא את מידת הזולוּת שלהם.</w:t>
+      </w:r>
     </w:p>
     <w:p>
       <w:pPr>
-        <w:spacing w:after="20"/>
+        <w:spacing w:after="120"/>
+        <w:rPr>
+          <w:rFonts w:cs="Segoe UI"/>
+        </w:rPr>
+      </w:pPr>
+      <w:r>
+        <w:rPr>
+          <w:rFonts w:cs="Segoe UI"/>
+        </w:rPr>
+        <w:t>הממצא החזק ביותר התקבל בבקרה השלילית (אחוז ההנחה), שהציגה מדדים זהים לחלוטין לערך האקראי. זהו אישוש מספרי מובהק לכך שהאשכולות אכן מתארים טיפוסי נכס פיזיים בלבד במנותק ממידת הזולוּת שלהם (בדיקה שציפינו שתכשל ואכן נכשלה מספקת ראיה חזקה לאמיתות המודל). מנגד, הבקרות החיוביות אישרו קשר מהותי לחלוקה: משתנה המחיר חשף קשר כלכלי מתון המרוכז באשכולות הקצה (נכסים גדולים כיקרים מול קומפקטיים כזולים). לבסוף, משתנה סוג החדר (</w:t>
+      </w:r>
+      <w:proofErr w:type="spellStart"/>
+      <w:r>
+        <w:rPr>
+          <w:rFonts w:cs="Segoe UI"/>
+          <w:rtl w:val="0"/>
+        </w:rPr>
+        <w:t>room_type</w:t>
+      </w:r>
+      <w:proofErr w:type="spellEnd"/>
+      <w:r>
+        <w:rPr>
+          <w:rFonts w:cs="Segoe UI"/>
+        </w:rPr>
+        <w:t xml:space="preserve">) המחיש היטב מדוע נדרש ערך בסיס אקראי: למרות ציון </w:t>
+      </w:r>
+      <w:r>
+        <w:rPr>
+          <w:rFonts w:cs="Segoe UI"/>
+          <w:rtl w:val="0"/>
+        </w:rPr>
+        <w:t>Purity</w:t>
+      </w:r>
+      <w:r>
+        <w:rPr>
+          <w:rFonts w:cs="Segoe UI"/>
+        </w:rPr>
+        <w:t xml:space="preserve"> גבוה לכאורה (0.772), הוא היה זהה לאקראי בשל הדומיננטיות של דירות שלמות במדגם (77%), ורק מדד ה-</w:t>
+      </w:r>
+      <w:r>
+        <w:rPr>
+          <w:rFonts w:cs="Segoe UI"/>
+          <w:rtl w:val="0"/>
+        </w:rPr>
+        <w:t>Entropy</w:t>
+      </w:r>
+      <w:r>
+        <w:rPr>
+          <w:rFonts w:cs="Segoe UI"/>
+        </w:rPr>
+        <w:t>, שהינו רגיש יותר, זיהה בהצלחה את המבנה האמיתי בנתונים (כדוגמת קבוצת הנכסים הגדולים המורכבת מ-100% דירות שלמות).</w:t>
+      </w:r>
+    </w:p>
+    <w:p>
+      <w:pPr>
+        <w:spacing w:after="120"/>
+        <w:rPr>
+          <w:rFonts w:cs="Segoe UI"/>
+        </w:rPr>
       </w:pPr>
       <w:r>
         <w:rPr>
@@ -7401,51 +6240,103 @@
     <w:p>
       <w:pPr>
         <w:spacing w:after="120"/>
-      </w:pPr>
-      <w:r>
-        <w:rPr>
-          <w:rFonts w:cs="Segoe UI"/>
-        </w:rPr>
-        <w:t xml:space="preserve"> המגבלה המרכזית של הניתוח היא ציוני </w:t>
-      </w:r>
-      <w:proofErr w:type="spellStart"/>
-      <w:r>
-        <w:rPr>
-          <w:rFonts w:cs="Segoe UI"/>
-        </w:rPr>
-        <w:t>ה־Silhouette</w:t>
-      </w:r>
-      <w:proofErr w:type="spellEnd"/>
-      <w:r>
-        <w:rPr>
-          <w:rFonts w:cs="Segoe UI"/>
-        </w:rPr>
-        <w:t xml:space="preserve"> הנמוכים (0.22–0.30). הם מעידים על כך שהקבוצות אינן מופרדות היטב במרחב חמשת המשתנים, אלא מהוות חיתוך של ענן רציף. לכן יש להתייחס לחלוקה כאל תיאור שימושי של טיפוסי נכס, ולא כאל מבנה טבעי </w:t>
-      </w:r>
-      <w:proofErr w:type="spellStart"/>
-      <w:r>
-        <w:rPr>
-          <w:rFonts w:cs="Segoe UI"/>
-        </w:rPr>
-        <w:t>חד־משמעי</w:t>
-      </w:r>
-      <w:proofErr w:type="spellEnd"/>
-      <w:r>
-        <w:rPr>
-          <w:rFonts w:cs="Segoe UI"/>
-        </w:rPr>
-        <w:t xml:space="preserve"> הקיים בנתונים.</w:t>
+        <w:rPr>
+          <w:rFonts w:cs="Segoe UI"/>
+        </w:rPr>
+      </w:pPr>
+      <w:r>
+        <w:rPr>
+          <w:rFonts w:cs="Segoe UI"/>
+        </w:rPr>
+        <w:t>המגבלה המרכזית בניתוח הי</w:t>
+      </w:r>
+      <w:r>
+        <w:rPr>
+          <w:rFonts w:cs="Segoe UI" w:hint="cs"/>
+        </w:rPr>
+        <w:t>יתה</w:t>
+      </w:r>
+      <w:r>
+        <w:rPr>
+          <w:rFonts w:cs="Segoe UI"/>
+        </w:rPr>
+        <w:t xml:space="preserve"> </w:t>
+      </w:r>
+      <w:r>
+        <w:rPr>
+          <w:rFonts w:cs="Segoe UI" w:hint="cs"/>
+        </w:rPr>
+        <w:t>ה</w:t>
+      </w:r>
+      <w:r>
+        <w:rPr>
+          <w:rFonts w:cs="Segoe UI"/>
+        </w:rPr>
+        <w:t xml:space="preserve">"מרפק" </w:t>
+      </w:r>
+      <w:r>
+        <w:rPr>
+          <w:rFonts w:cs="Segoe UI" w:hint="cs"/>
+        </w:rPr>
+        <w:t>ה</w:t>
+      </w:r>
+      <w:r>
+        <w:rPr>
+          <w:rFonts w:cs="Segoe UI"/>
+        </w:rPr>
+        <w:t>רך בעקומת ה-</w:t>
+      </w:r>
+      <w:r>
+        <w:rPr>
+          <w:rFonts w:cs="Segoe UI"/>
+          <w:rtl w:val="0"/>
+        </w:rPr>
+        <w:t>SSE</w:t>
+      </w:r>
+      <w:r>
+        <w:rPr>
+          <w:rFonts w:cs="Segoe UI"/>
+        </w:rPr>
+        <w:t>, המעיד כי הנתונים נפרשים על רצף ולא מתחלקים טבעית לקבוצות מובדלות לחלוטין (משום כך, הבחירה ב</w:t>
+      </w:r>
+      <w:r>
+        <w:rPr>
+          <w:rFonts w:cs="Segoe UI" w:hint="cs"/>
+        </w:rPr>
+        <w:t>-</w:t>
+      </w:r>
+      <w:r>
+        <w:rPr>
+          <w:rFonts w:cs="Segoe UI"/>
+          <w:rtl w:val="0"/>
+        </w:rPr>
+        <w:t>k=4</w:t>
+      </w:r>
+      <w:r>
+        <w:rPr>
+          <w:rFonts w:cs="Segoe UI"/>
+        </w:rPr>
+        <w:t xml:space="preserve"> היא החלטה פרשנית מוצהרת). שנית, קיימים פערים ניכרים בגדלי האשכולות: קבוצת החוף כוללת 18 נכסים בלבד (לעומת 203 בגדולה ביותר), ולכן המסקנות לגביה מחייבות זהירות. לבסוף, תוצאות החלוקה והמסקנה שהמיקום אינו גורם מפריד, תקפות אך ורק בהינתן חמשת המשתנים הספציפיים שהוזנו לאלגוריתם.</w:t>
       </w:r>
     </w:p>
     <w:p>
       <w:pPr>
-        <w:spacing w:after="120"/>
-      </w:pPr>
-      <w:r>
-        <w:rPr>
-          <w:rFonts w:cs="Segoe UI"/>
-        </w:rPr>
-        <w:t>בנוסף, גדלי הקבוצות אינם אחידים: הקבוצה הגדולה מונה 178 נכסים, בעוד שקבוצת החוף מונה 18 בלבד. מאפייניה של הקבוצה הקטנה מבוססים על מספר נכסים מצומצם יחסית, ולכן יש לפרש אותם בזהירות רבה יותר.</w:t>
+        <w:bidi w:val="0"/>
+        <w:rPr>
+          <w:rFonts w:cs="Segoe UI"/>
+          <w:b/>
+          <w:color w:val="0B3D4D"/>
+          <w:sz w:val="30"/>
+        </w:rPr>
+      </w:pPr>
+      <w:r>
+        <w:rPr>
+          <w:rFonts w:cs="Segoe UI"/>
+          <w:b/>
+          <w:color w:val="0B3D4D"/>
+          <w:sz w:val="30"/>
+        </w:rPr>
+        <w:br w:type="page"/>
       </w:r>
     </w:p>
     <w:p>
@@ -7964,7 +6855,7 @@
                     <pic:cNvPicPr/>
                   </pic:nvPicPr>
                   <pic:blipFill>
-                    <a:blip r:embed="rId12"/>
+                    <a:blip r:embed="rId13"/>
                     <a:stretch>
                       <a:fillRect/>
                     </a:stretch>
@@ -9132,7 +8023,7 @@
                     <pic:cNvPicPr/>
                   </pic:nvPicPr>
                   <pic:blipFill>
-                    <a:blip r:embed="rId13"/>
+                    <a:blip r:embed="rId14"/>
                     <a:stretch>
                       <a:fillRect/>
                     </a:stretch>
@@ -11850,6 +10741,119 @@
     </w:lvl>
   </w:abstractNum>
   <w:abstractNum w:abstractNumId="13" w15:restartNumberingAfterBreak="0">
+    <w:nsid w:val="101A556B"/>
+    <w:multiLevelType w:val="hybridMultilevel"/>
+    <w:tmpl w:val="7CB6BA0E"/>
+    <w:lvl w:ilvl="0" w:tplc="20000001">
+      <w:start w:val="1"/>
+      <w:numFmt w:val="bullet"/>
+      <w:lvlText w:val=""/>
+      <w:lvlJc w:val="left"/>
+      <w:pPr>
+        <w:ind w:left="720" w:hanging="360"/>
+      </w:pPr>
+      <w:rPr>
+        <w:rFonts w:ascii="Symbol" w:hAnsi="Symbol" w:hint="default"/>
+      </w:rPr>
+    </w:lvl>
+    <w:lvl w:ilvl="1" w:tplc="04090003" w:tentative="1">
+      <w:start w:val="1"/>
+      <w:numFmt w:val="bullet"/>
+      <w:lvlText w:val="o"/>
+      <w:lvlJc w:val="left"/>
+      <w:pPr>
+        <w:ind w:left="1440" w:hanging="360"/>
+      </w:pPr>
+      <w:rPr>
+        <w:rFonts w:ascii="Courier New" w:hAnsi="Courier New" w:cs="Courier New" w:hint="default"/>
+      </w:rPr>
+    </w:lvl>
+    <w:lvl w:ilvl="2" w:tplc="04090005" w:tentative="1">
+      <w:start w:val="1"/>
+      <w:numFmt w:val="bullet"/>
+      <w:lvlText w:val=""/>
+      <w:lvlJc w:val="left"/>
+      <w:pPr>
+        <w:ind w:left="2160" w:hanging="360"/>
+      </w:pPr>
+      <w:rPr>
+        <w:rFonts w:ascii="Wingdings" w:hAnsi="Wingdings" w:hint="default"/>
+      </w:rPr>
+    </w:lvl>
+    <w:lvl w:ilvl="3" w:tplc="04090001" w:tentative="1">
+      <w:start w:val="1"/>
+      <w:numFmt w:val="bullet"/>
+      <w:lvlText w:val=""/>
+      <w:lvlJc w:val="left"/>
+      <w:pPr>
+        <w:ind w:left="2880" w:hanging="360"/>
+      </w:pPr>
+      <w:rPr>
+        <w:rFonts w:ascii="Symbol" w:hAnsi="Symbol" w:hint="default"/>
+      </w:rPr>
+    </w:lvl>
+    <w:lvl w:ilvl="4" w:tplc="04090003" w:tentative="1">
+      <w:start w:val="1"/>
+      <w:numFmt w:val="bullet"/>
+      <w:lvlText w:val="o"/>
+      <w:lvlJc w:val="left"/>
+      <w:pPr>
+        <w:ind w:left="3600" w:hanging="360"/>
+      </w:pPr>
+      <w:rPr>
+        <w:rFonts w:ascii="Courier New" w:hAnsi="Courier New" w:cs="Courier New" w:hint="default"/>
+      </w:rPr>
+    </w:lvl>
+    <w:lvl w:ilvl="5" w:tplc="04090005" w:tentative="1">
+      <w:start w:val="1"/>
+      <w:numFmt w:val="bullet"/>
+      <w:lvlText w:val=""/>
+      <w:lvlJc w:val="left"/>
+      <w:pPr>
+        <w:ind w:left="4320" w:hanging="360"/>
+      </w:pPr>
+      <w:rPr>
+        <w:rFonts w:ascii="Wingdings" w:hAnsi="Wingdings" w:hint="default"/>
+      </w:rPr>
+    </w:lvl>
+    <w:lvl w:ilvl="6" w:tplc="04090001" w:tentative="1">
+      <w:start w:val="1"/>
+      <w:numFmt w:val="bullet"/>
+      <w:lvlText w:val=""/>
+      <w:lvlJc w:val="left"/>
+      <w:pPr>
+        <w:ind w:left="5040" w:hanging="360"/>
+      </w:pPr>
+      <w:rPr>
+        <w:rFonts w:ascii="Symbol" w:hAnsi="Symbol" w:hint="default"/>
+      </w:rPr>
+    </w:lvl>
+    <w:lvl w:ilvl="7" w:tplc="04090003" w:tentative="1">
+      <w:start w:val="1"/>
+      <w:numFmt w:val="bullet"/>
+      <w:lvlText w:val="o"/>
+      <w:lvlJc w:val="left"/>
+      <w:pPr>
+        <w:ind w:left="5760" w:hanging="360"/>
+      </w:pPr>
+      <w:rPr>
+        <w:rFonts w:ascii="Courier New" w:hAnsi="Courier New" w:cs="Courier New" w:hint="default"/>
+      </w:rPr>
+    </w:lvl>
+    <w:lvl w:ilvl="8" w:tplc="04090005" w:tentative="1">
+      <w:start w:val="1"/>
+      <w:numFmt w:val="bullet"/>
+      <w:lvlText w:val=""/>
+      <w:lvlJc w:val="left"/>
+      <w:pPr>
+        <w:ind w:left="6480" w:hanging="360"/>
+      </w:pPr>
+      <w:rPr>
+        <w:rFonts w:ascii="Wingdings" w:hAnsi="Wingdings" w:hint="default"/>
+      </w:rPr>
+    </w:lvl>
+  </w:abstractNum>
+  <w:abstractNum w:abstractNumId="14" w15:restartNumberingAfterBreak="0">
     <w:nsid w:val="250445BC"/>
     <w:multiLevelType w:val="multilevel"/>
     <w:tmpl w:val="21B809AE"/>
@@ -11998,7 +11002,7 @@
       </w:rPr>
     </w:lvl>
   </w:abstractNum>
-  <w:abstractNum w:abstractNumId="14" w15:restartNumberingAfterBreak="0">
+  <w:abstractNum w:abstractNumId="15" w15:restartNumberingAfterBreak="0">
     <w:nsid w:val="258F064E"/>
     <w:multiLevelType w:val="hybridMultilevel"/>
     <w:tmpl w:val="723A84C0"/>
@@ -12087,7 +11091,7 @@
       </w:pPr>
     </w:lvl>
   </w:abstractNum>
-  <w:abstractNum w:abstractNumId="15" w15:restartNumberingAfterBreak="0">
+  <w:abstractNum w:abstractNumId="16" w15:restartNumberingAfterBreak="0">
     <w:nsid w:val="2DD2120C"/>
     <w:multiLevelType w:val="multilevel"/>
     <w:tmpl w:val="F9A86378"/>
@@ -12200,7 +11204,7 @@
       </w:pPr>
     </w:lvl>
   </w:abstractNum>
-  <w:abstractNum w:abstractNumId="16" w15:restartNumberingAfterBreak="0">
+  <w:abstractNum w:abstractNumId="17" w15:restartNumberingAfterBreak="0">
     <w:nsid w:val="4CE94B82"/>
     <w:multiLevelType w:val="multilevel"/>
     <w:tmpl w:val="F89882E6"/>
@@ -12349,7 +11353,7 @@
       </w:rPr>
     </w:lvl>
   </w:abstractNum>
-  <w:abstractNum w:abstractNumId="17" w15:restartNumberingAfterBreak="0">
+  <w:abstractNum w:abstractNumId="18" w15:restartNumberingAfterBreak="0">
     <w:nsid w:val="7BD3276C"/>
     <w:multiLevelType w:val="hybridMultilevel"/>
     <w:tmpl w:val="D9D691D4"/>
@@ -12493,19 +11497,19 @@
     <w:abstractNumId w:val="7"/>
   </w:num>
   <w:num w:numId="11" w16cid:durableId="836306477">
-    <w:abstractNumId w:val="15"/>
+    <w:abstractNumId w:val="16"/>
   </w:num>
   <w:num w:numId="12" w16cid:durableId="1669870828">
-    <w:abstractNumId w:val="13"/>
+    <w:abstractNumId w:val="14"/>
   </w:num>
   <w:num w:numId="13" w16cid:durableId="2008093198">
     <w:abstractNumId w:val="12"/>
   </w:num>
   <w:num w:numId="14" w16cid:durableId="394666151">
-    <w:abstractNumId w:val="16"/>
+    <w:abstractNumId w:val="17"/>
   </w:num>
   <w:num w:numId="15" w16cid:durableId="1523013830">
-    <w:abstractNumId w:val="17"/>
+    <w:abstractNumId w:val="18"/>
   </w:num>
   <w:num w:numId="16" w16cid:durableId="1403022009">
     <w:abstractNumId w:val="9"/>
@@ -12514,10 +11518,13 @@
     <w:abstractNumId w:val="10"/>
   </w:num>
   <w:num w:numId="18" w16cid:durableId="1616909384">
-    <w:abstractNumId w:val="14"/>
+    <w:abstractNumId w:val="15"/>
   </w:num>
   <w:num w:numId="19" w16cid:durableId="1936552636">
     <w:abstractNumId w:val="11"/>
+  </w:num>
+  <w:num w:numId="20" w16cid:durableId="234361747">
+    <w:abstractNumId w:val="13"/>
   </w:num>
 </w:numbering>
 </file>

</xml_diff>